<commit_message>
Dokument weiter ausgearbeitet mit Nico
</commit_message>
<xml_diff>
--- a/Diplomarbeitstitel.docx
+++ b/Diplomarbeitstitel.docx
@@ -2,83 +2,1111 @@
 <file path=word/document.xml><?xml version="1.0" encoding="utf-8"?>
 <w:document xmlns:wpc="http://schemas.microsoft.com/office/word/2010/wordprocessingCanvas" xmlns:cx="http://schemas.microsoft.com/office/drawing/2014/chartex" xmlns:cx1="http://schemas.microsoft.com/office/drawing/2015/9/8/chartex" xmlns:cx2="http://schemas.microsoft.com/office/drawing/2015/10/21/chartex" xmlns:cx3="http://schemas.microsoft.com/office/drawing/2016/5/9/chartex" xmlns:cx4="http://schemas.microsoft.com/office/drawing/2016/5/10/chartex" xmlns:cx5="http://schemas.microsoft.com/office/drawing/2016/5/11/chartex" xmlns:cx6="http://schemas.microsoft.com/office/drawing/2016/5/12/chartex" xmlns:cx7="http://schemas.microsoft.com/office/drawing/2016/5/13/chartex" xmlns:cx8="http://schemas.microsoft.com/office/drawing/2016/5/14/chartex" xmlns:mc="http://schemas.openxmlformats.org/markup-compatibility/2006" xmlns:aink="http://schemas.microsoft.com/office/drawing/2016/ink" xmlns:am3d="http://schemas.microsoft.com/office/drawing/2017/model3d" xmlns:o="urn:schemas-microsoft-com:office:office" xmlns:oel="http://schemas.microsoft.com/office/2019/extlst" xmlns:r="http://schemas.openxmlformats.org/officeDocument/2006/relationships" xmlns:m="http://schemas.openxmlformats.org/officeDocument/2006/math" xmlns:v="urn:schemas-microsoft-com:vml" xmlns:wp14="http://schemas.microsoft.com/office/word/2010/wordprocessingDrawing" xmlns:wp="http://schemas.openxmlformats.org/drawingml/2006/wordprocessingDrawing" xmlns:w10="urn:schemas-microsoft-com:office:word" xmlns:w="http://schemas.openxmlformats.org/wordprocessingml/2006/main" xmlns:w14="http://schemas.microsoft.com/office/word/2010/wordml" xmlns:w15="http://schemas.microsoft.com/office/word/2012/wordml" xmlns:w16cex="http://schemas.microsoft.com/office/word/2018/wordml/cex" xmlns:w16cid="http://schemas.microsoft.com/office/word/2016/wordml/cid" xmlns:w16="http://schemas.microsoft.com/office/word/2018/wordml" xmlns:w16du="http://schemas.microsoft.com/office/word/2023/wordml/word16du" xmlns:w16sdtdh="http://schemas.microsoft.com/office/word/2020/wordml/sdtdatahash" xmlns:w16sdtfl="http://schemas.microsoft.com/office/word/2024/wordml/sdtformatlock" xmlns:w16se="http://schemas.microsoft.com/office/word/2015/wordml/symex" xmlns:wpg="http://schemas.microsoft.com/office/word/2010/wordprocessingGroup" xmlns:wpi="http://schemas.microsoft.com/office/word/2010/wordprocessingInk" xmlns:wne="http://schemas.microsoft.com/office/word/2006/wordml" xmlns:wps="http://schemas.microsoft.com/office/word/2010/wordprocessingShape" mc:Ignorable="w14 w15 w16se w16cid w16 w16cex w16sdtdh w16sdtfl w16du wp14">
   <w:body>
-    <w:p/>
+    <w:p>
+      <w:pPr>
+        <w:rPr>
+          <w:rFonts w:ascii="Arial" w:hAnsi="Arial" w:cs="Arial"/>
+          <w:color w:val="000000" w:themeColor="text1"/>
+        </w:rPr>
+      </w:pPr>
+    </w:p>
     <w:p>
       <w:pPr>
         <w:shd w:val="clear" w:color="auto" w:fill="FFFFFF"/>
-        <w:spacing w:after="213" w:line="240" w:lineRule="auto"/>
+        <w:spacing w:after="213"/>
         <w:outlineLvl w:val="2"/>
         <w:rPr>
-          <w:rFonts w:ascii="Arial" w:eastAsia="Times New Roman" w:hAnsi="Arial" w:cs="Arial"/>
+          <w:rFonts w:ascii="Arial" w:hAnsi="Arial" w:cs="Arial"/>
           <w:b/>
           <w:bCs/>
-          <w:color w:val="333333"/>
-          <w:kern w:val="0"/>
+          <w:color w:val="000000" w:themeColor="text1"/>
           <w:sz w:val="27"/>
           <w:szCs w:val="27"/>
-          <w:lang w:eastAsia="de-DE"/>
-          <w14:ligatures w14:val="none"/>
-        </w:rPr>
-      </w:pPr>
-      <w:r>
-        <w:rPr>
-          <w:rFonts w:ascii="Arial" w:eastAsia="Times New Roman" w:hAnsi="Arial" w:cs="Arial"/>
+        </w:rPr>
+      </w:pPr>
+      <w:r>
+        <w:rPr>
+          <w:rFonts w:ascii="Arial" w:hAnsi="Arial" w:cs="Arial"/>
           <w:b/>
           <w:bCs/>
-          <w:color w:val="333333"/>
-          <w:kern w:val="0"/>
+          <w:color w:val="000000" w:themeColor="text1"/>
           <w:sz w:val="27"/>
           <w:szCs w:val="27"/>
-          <w:lang w:eastAsia="de-DE"/>
-          <w14:ligatures w14:val="none"/>
-        </w:rPr>
-        <w:t>Diplomarbeitstitel</w:t>
-      </w:r>
-      <w:r>
-        <w:rPr>
-          <w:rFonts w:ascii="Arial" w:eastAsia="Times New Roman" w:hAnsi="Arial" w:cs="Arial"/>
+        </w:rPr>
+        <w:t>Diplomarbeitstitel:</w:t>
+      </w:r>
+    </w:p>
+    <w:p>
+      <w:pPr>
+        <w:shd w:val="clear" w:color="auto" w:fill="FFFFFF"/>
+        <w:spacing w:after="213"/>
+        <w:outlineLvl w:val="2"/>
+        <w:rPr>
+          <w:rFonts w:ascii="Arial" w:hAnsi="Arial" w:cs="Arial"/>
+          <w:color w:val="000000" w:themeColor="text1"/>
+          <w:sz w:val="27"/>
+          <w:szCs w:val="27"/>
+        </w:rPr>
+      </w:pPr>
+      <w:r>
+        <w:rPr>
+          <w:rFonts w:ascii="Arial" w:hAnsi="Arial" w:cs="Arial"/>
+          <w:color w:val="000000" w:themeColor="text1"/>
+          <w:sz w:val="27"/>
+          <w:szCs w:val="27"/>
+        </w:rPr>
+        <w:t>Desk</w:t>
+      </w:r>
+      <w:r>
+        <w:rPr>
+          <w:rFonts w:ascii="Arial" w:hAnsi="Arial" w:cs="Arial"/>
+          <w:color w:val="000000" w:themeColor="text1"/>
+          <w:sz w:val="27"/>
+          <w:szCs w:val="27"/>
+        </w:rPr>
+        <w:t>Vision</w:t>
+      </w:r>
+      <w:r>
+        <w:rPr>
+          <w:rFonts w:ascii="Arial" w:hAnsi="Arial" w:cs="Arial"/>
+          <w:color w:val="000000" w:themeColor="text1"/>
+          <w:sz w:val="27"/>
+          <w:szCs w:val="27"/>
+        </w:rPr>
+        <w:t xml:space="preserve"> - Interaktive Webanwendung zur Verwaltung und Reservierung von Arbeitsplätzen</w:t>
+      </w:r>
+    </w:p>
+    <w:p>
+      <w:pPr>
+        <w:shd w:val="clear" w:color="auto" w:fill="FFFFFF"/>
+        <w:spacing w:after="213"/>
+        <w:outlineLvl w:val="2"/>
+        <w:rPr>
+          <w:rFonts w:ascii="Arial" w:hAnsi="Arial" w:cs="Arial"/>
+          <w:color w:val="000000" w:themeColor="text1"/>
+          <w:sz w:val="27"/>
+          <w:szCs w:val="27"/>
+        </w:rPr>
+      </w:pPr>
+    </w:p>
+    <w:p>
+      <w:pPr>
+        <w:shd w:val="clear" w:color="auto" w:fill="FFFFFF"/>
+        <w:spacing w:after="213"/>
+        <w:outlineLvl w:val="2"/>
+        <w:rPr>
+          <w:rFonts w:ascii="Arial" w:hAnsi="Arial" w:cs="Arial"/>
+          <w:color w:val="000000" w:themeColor="text1"/>
+          <w:sz w:val="27"/>
+          <w:szCs w:val="27"/>
+        </w:rPr>
+      </w:pPr>
+      <w:r>
+        <w:rPr>
+          <w:rFonts w:ascii="Arial" w:hAnsi="Arial" w:cs="Arial"/>
+          <w:color w:val="000000" w:themeColor="text1"/>
+          <w:sz w:val="27"/>
+          <w:szCs w:val="27"/>
+        </w:rPr>
+        <w:t>Ausgangslage:</w:t>
+      </w:r>
+    </w:p>
+    <w:p>
+      <w:pPr>
+        <w:shd w:val="clear" w:color="auto" w:fill="FFFFFF"/>
+        <w:spacing w:after="213"/>
+        <w:outlineLvl w:val="2"/>
+        <w:rPr>
+          <w:rFonts w:ascii="Arial" w:hAnsi="Arial" w:cs="Arial"/>
+          <w:color w:val="000000" w:themeColor="text1"/>
+          <w:sz w:val="27"/>
+          <w:szCs w:val="27"/>
+        </w:rPr>
+      </w:pPr>
+      <w:proofErr w:type="gramStart"/>
+      <w:r>
+        <w:rPr>
+          <w:rFonts w:ascii="Arial" w:hAnsi="Arial" w:cs="Arial"/>
+          <w:color w:val="000000" w:themeColor="text1"/>
+          <w:sz w:val="27"/>
+          <w:szCs w:val="27"/>
+        </w:rPr>
+        <w:t>Durch zunehmendes</w:t>
+      </w:r>
+      <w:proofErr w:type="gramEnd"/>
+      <w:r>
+        <w:rPr>
+          <w:rFonts w:ascii="Arial" w:hAnsi="Arial" w:cs="Arial"/>
+          <w:color w:val="000000" w:themeColor="text1"/>
+          <w:sz w:val="27"/>
+          <w:szCs w:val="27"/>
+        </w:rPr>
+        <w:t xml:space="preserve"> Homeoffice und flexible Arbeitszeiten fehlt im Unternehmen Holter eine klare Verwaltung der Büroarbeitsplätze. </w:t>
+      </w:r>
+      <w:r>
+        <w:rPr>
+          <w:rFonts w:ascii="Arial" w:hAnsi="Arial" w:cs="Arial"/>
+          <w:color w:val="000000" w:themeColor="text1"/>
+          <w:sz w:val="27"/>
+          <w:szCs w:val="27"/>
+        </w:rPr>
+        <w:t xml:space="preserve">Sie </w:t>
+      </w:r>
+      <w:r>
+        <w:rPr>
+          <w:rFonts w:ascii="Arial" w:hAnsi="Arial" w:cs="Arial"/>
+          <w:color w:val="000000" w:themeColor="text1"/>
+          <w:sz w:val="27"/>
+          <w:szCs w:val="27"/>
+        </w:rPr>
+        <w:t>ha</w:t>
+      </w:r>
+      <w:r>
+        <w:rPr>
+          <w:rFonts w:ascii="Arial" w:hAnsi="Arial" w:cs="Arial"/>
+          <w:color w:val="000000" w:themeColor="text1"/>
+          <w:sz w:val="27"/>
+          <w:szCs w:val="27"/>
+        </w:rPr>
+        <w:t>ben</w:t>
+      </w:r>
+      <w:r>
+        <w:rPr>
+          <w:rFonts w:ascii="Arial" w:hAnsi="Arial" w:cs="Arial"/>
+          <w:color w:val="000000" w:themeColor="text1"/>
+          <w:sz w:val="27"/>
+          <w:szCs w:val="27"/>
+        </w:rPr>
+        <w:t xml:space="preserve"> dafür kein geeignetes System, weshalb sie oft auf manuelle Lösungen zurückgreifen müssen, was zu einer fehlenden Übersicht, ineffizienter Nutzung und möglichen Doppelbelegungen führt.</w:t>
+      </w:r>
+    </w:p>
+    <w:p>
+      <w:pPr>
+        <w:shd w:val="clear" w:color="auto" w:fill="FFFFFF"/>
+        <w:spacing w:after="213"/>
+        <w:outlineLvl w:val="2"/>
+        <w:rPr>
+          <w:rFonts w:ascii="Arial" w:hAnsi="Arial" w:cs="Arial"/>
+          <w:color w:val="000000" w:themeColor="text1"/>
+          <w:sz w:val="27"/>
+          <w:szCs w:val="27"/>
+        </w:rPr>
+      </w:pPr>
+    </w:p>
+    <w:p>
+      <w:pPr>
+        <w:shd w:val="clear" w:color="auto" w:fill="FFFFFF"/>
+        <w:spacing w:after="213"/>
+        <w:outlineLvl w:val="2"/>
+        <w:rPr>
+          <w:rFonts w:ascii="Arial" w:hAnsi="Arial" w:cs="Arial"/>
           <w:b/>
           <w:bCs/>
-          <w:color w:val="333333"/>
-          <w:kern w:val="0"/>
+          <w:color w:val="000000" w:themeColor="text1"/>
           <w:sz w:val="27"/>
           <w:szCs w:val="27"/>
-          <w:lang w:eastAsia="de-DE"/>
-          <w14:ligatures w14:val="none"/>
-        </w:rPr>
-        <w:t>:</w:t>
-      </w:r>
-    </w:p>
-    <w:p>
-      <w:pPr>
-        <w:shd w:val="clear" w:color="auto" w:fill="FFFFFF"/>
-        <w:spacing w:after="213" w:line="240" w:lineRule="auto"/>
-        <w:outlineLvl w:val="2"/>
-        <w:rPr>
-          <w:rFonts w:ascii="Arial" w:eastAsia="Times New Roman" w:hAnsi="Arial" w:cs="Arial"/>
-          <w:color w:val="333333"/>
-          <w:kern w:val="0"/>
+        </w:rPr>
+      </w:pPr>
+      <w:r>
+        <w:rPr>
+          <w:rFonts w:ascii="Arial" w:hAnsi="Arial" w:cs="Arial"/>
+          <w:b/>
+          <w:bCs/>
+          <w:color w:val="000000" w:themeColor="text1"/>
           <w:sz w:val="27"/>
           <w:szCs w:val="27"/>
-          <w:lang w:eastAsia="de-DE"/>
-          <w14:ligatures w14:val="none"/>
-        </w:rPr>
-      </w:pPr>
-      <w:r>
-        <w:rPr>
-          <w:rFonts w:ascii="Arial" w:eastAsia="Times New Roman" w:hAnsi="Arial" w:cs="Arial"/>
-          <w:color w:val="333333"/>
-          <w:kern w:val="0"/>
+        </w:rPr>
+        <w:t>Untersuchungsanliegen der individuellen Themenstellungen</w:t>
+      </w:r>
+      <w:r>
+        <w:rPr>
+          <w:rFonts w:ascii="Arial" w:hAnsi="Arial" w:cs="Arial"/>
+          <w:b/>
+          <w:bCs/>
+          <w:color w:val="000000" w:themeColor="text1"/>
           <w:sz w:val="27"/>
           <w:szCs w:val="27"/>
-          <w:lang w:eastAsia="de-DE"/>
-          <w14:ligatures w14:val="none"/>
-        </w:rPr>
-        <w:t>DeskFlow - Interaktive Webanwendung zur Verwaltung und Reservierung von Arbeitsplätzen im Unternehmen Holter</w:t>
-      </w:r>
+        </w:rPr>
+        <w:t>:</w:t>
+      </w:r>
+    </w:p>
+    <w:p>
+      <w:pPr>
+        <w:spacing w:before="100" w:beforeAutospacing="1" w:after="100" w:afterAutospacing="1"/>
+        <w:outlineLvl w:val="1"/>
+        <w:rPr>
+          <w:rFonts w:ascii="Arial" w:hAnsi="Arial" w:cs="Arial"/>
+          <w:b/>
+          <w:bCs/>
+          <w:color w:val="000000" w:themeColor="text1"/>
+          <w:sz w:val="36"/>
+          <w:szCs w:val="36"/>
+        </w:rPr>
+      </w:pPr>
+      <w:r>
+        <w:rPr>
+          <w:rFonts w:ascii="Arial" w:hAnsi="Arial" w:cs="Arial"/>
+          <w:b/>
+          <w:bCs/>
+          <w:color w:val="000000" w:themeColor="text1"/>
+          <w:sz w:val="36"/>
+          <w:szCs w:val="36"/>
+        </w:rPr>
+        <w:t>Deniz Bernecker</w:t>
+      </w:r>
+    </w:p>
+    <w:p>
+      <w:pPr>
+        <w:numPr>
+          <w:ilvl w:val="0"/>
+          <w:numId w:val="1"/>
+        </w:numPr>
+        <w:spacing w:before="100" w:beforeAutospacing="1" w:after="100" w:afterAutospacing="1"/>
+        <w:rPr>
+          <w:rFonts w:ascii="Arial" w:hAnsi="Arial" w:cs="Arial"/>
+          <w:color w:val="000000" w:themeColor="text1"/>
+        </w:rPr>
+      </w:pPr>
+      <w:r>
+        <w:rPr>
+          <w:rFonts w:ascii="Arial" w:hAnsi="Arial" w:cs="Arial"/>
+          <w:color w:val="000000" w:themeColor="text1"/>
+        </w:rPr>
+        <w:t xml:space="preserve">Untersuchen, wie eine übersichtliche und benutzerfreundliche Darstellung der Büroarbeitsplätze in Vogelperspektive umgesetzt werden kann. Dabei soll auch geprüft werden, welche Darstellungsformen von </w:t>
+      </w:r>
+      <w:proofErr w:type="spellStart"/>
+      <w:proofErr w:type="gramStart"/>
+      <w:r>
+        <w:rPr>
+          <w:rFonts w:ascii="Arial" w:hAnsi="Arial" w:cs="Arial"/>
+          <w:color w:val="000000" w:themeColor="text1"/>
+        </w:rPr>
+        <w:t>Nutzer:innen</w:t>
+      </w:r>
+      <w:proofErr w:type="spellEnd"/>
+      <w:proofErr w:type="gramEnd"/>
+      <w:r>
+        <w:rPr>
+          <w:rFonts w:ascii="Arial" w:hAnsi="Arial" w:cs="Arial"/>
+          <w:color w:val="000000" w:themeColor="text1"/>
+        </w:rPr>
+        <w:t xml:space="preserve"> am besten verstanden werden.</w:t>
+      </w:r>
+    </w:p>
+    <w:p>
+      <w:pPr>
+        <w:numPr>
+          <w:ilvl w:val="0"/>
+          <w:numId w:val="1"/>
+        </w:numPr>
+        <w:spacing w:before="100" w:beforeAutospacing="1" w:after="100" w:afterAutospacing="1"/>
+        <w:rPr>
+          <w:rFonts w:ascii="Arial" w:hAnsi="Arial" w:cs="Arial"/>
+          <w:color w:val="000000" w:themeColor="text1"/>
+        </w:rPr>
+      </w:pPr>
+      <w:r>
+        <w:rPr>
+          <w:rFonts w:ascii="Arial" w:hAnsi="Arial" w:cs="Arial"/>
+          <w:color w:val="000000" w:themeColor="text1"/>
+        </w:rPr>
+        <w:t>Evaluieren, welche Technologien und Frameworks sich für die Umsetzung einer interaktiven Weboberfläche eignen und wie diese effizient eingesetzt werden können.</w:t>
+      </w:r>
+    </w:p>
+    <w:p>
+      <w:pPr>
+        <w:numPr>
+          <w:ilvl w:val="0"/>
+          <w:numId w:val="1"/>
+        </w:numPr>
+        <w:spacing w:before="100" w:beforeAutospacing="1" w:after="100" w:afterAutospacing="1"/>
+        <w:rPr>
+          <w:rFonts w:ascii="Arial" w:hAnsi="Arial" w:cs="Arial"/>
+          <w:color w:val="000000" w:themeColor="text1"/>
+        </w:rPr>
+      </w:pPr>
+      <w:r>
+        <w:rPr>
+          <w:rFonts w:ascii="Arial" w:hAnsi="Arial" w:cs="Arial"/>
+          <w:color w:val="000000" w:themeColor="text1"/>
+        </w:rPr>
+        <w:t>Analysieren, wie die Interaktion mit Arbeitsplätzen (z. B. Auswahl, Anzeige von Informationen) gestaltet werden muss, damit sie ohne Einschulung nutzbar ist.</w:t>
+      </w:r>
+    </w:p>
+    <w:p>
+      <w:pPr>
+        <w:spacing w:before="100" w:beforeAutospacing="1" w:after="100" w:afterAutospacing="1"/>
+        <w:outlineLvl w:val="1"/>
+        <w:rPr>
+          <w:rFonts w:ascii="Arial" w:hAnsi="Arial" w:cs="Arial"/>
+          <w:b/>
+          <w:bCs/>
+          <w:color w:val="000000" w:themeColor="text1"/>
+          <w:sz w:val="36"/>
+          <w:szCs w:val="36"/>
+        </w:rPr>
+      </w:pPr>
+      <w:r>
+        <w:rPr>
+          <w:rFonts w:ascii="Arial" w:hAnsi="Arial" w:cs="Arial"/>
+          <w:b/>
+          <w:bCs/>
+          <w:color w:val="000000" w:themeColor="text1"/>
+          <w:sz w:val="36"/>
+          <w:szCs w:val="36"/>
+        </w:rPr>
+        <w:t>Nico Hofer</w:t>
+      </w:r>
+    </w:p>
+    <w:p>
+      <w:pPr>
+        <w:numPr>
+          <w:ilvl w:val="0"/>
+          <w:numId w:val="2"/>
+        </w:numPr>
+        <w:spacing w:before="100" w:beforeAutospacing="1" w:after="100" w:afterAutospacing="1"/>
+        <w:rPr>
+          <w:rFonts w:ascii="Arial" w:hAnsi="Arial" w:cs="Arial"/>
+          <w:color w:val="000000" w:themeColor="text1"/>
+        </w:rPr>
+      </w:pPr>
+      <w:r>
+        <w:rPr>
+          <w:rFonts w:ascii="Arial" w:hAnsi="Arial" w:cs="Arial"/>
+          <w:color w:val="000000" w:themeColor="text1"/>
+        </w:rPr>
+        <w:t>Evaluieren, welche Datenbankstruktur sich für die Speicherung von Arbeitsplätzen, Buchungen und Statistiken am besten eignet.</w:t>
+      </w:r>
+    </w:p>
+    <w:p>
+      <w:pPr>
+        <w:numPr>
+          <w:ilvl w:val="0"/>
+          <w:numId w:val="2"/>
+        </w:numPr>
+        <w:spacing w:before="100" w:beforeAutospacing="1" w:after="100" w:afterAutospacing="1"/>
+        <w:rPr>
+          <w:rFonts w:ascii="Arial" w:hAnsi="Arial" w:cs="Arial"/>
+          <w:color w:val="000000" w:themeColor="text1"/>
+        </w:rPr>
+      </w:pPr>
+      <w:r>
+        <w:rPr>
+          <w:rFonts w:ascii="Arial" w:hAnsi="Arial" w:cs="Arial"/>
+          <w:color w:val="000000" w:themeColor="text1"/>
+        </w:rPr>
+        <w:t>Analysieren, wie Authentifizierung und Benutzerverwaltung ohne reale Unternehmensdaten umgesetzt werden können</w:t>
+      </w:r>
+      <w:r>
+        <w:rPr>
+          <w:rFonts w:ascii="Arial" w:hAnsi="Arial" w:cs="Arial"/>
+          <w:color w:val="000000" w:themeColor="text1"/>
+        </w:rPr>
+        <w:t>.</w:t>
+      </w:r>
+    </w:p>
+    <w:p>
+      <w:pPr>
+        <w:numPr>
+          <w:ilvl w:val="0"/>
+          <w:numId w:val="2"/>
+        </w:numPr>
+        <w:spacing w:before="100" w:beforeAutospacing="1" w:after="100" w:afterAutospacing="1"/>
+        <w:rPr>
+          <w:rFonts w:ascii="Arial" w:hAnsi="Arial" w:cs="Arial"/>
+          <w:color w:val="000000" w:themeColor="text1"/>
+        </w:rPr>
+      </w:pPr>
+      <w:r>
+        <w:rPr>
+          <w:rFonts w:ascii="Arial" w:hAnsi="Arial" w:cs="Arial"/>
+          <w:color w:val="000000" w:themeColor="text1"/>
+        </w:rPr>
+        <w:t>Prüfen, wie administrative Funktionen (z. B. Anlegen und Verwalten von Arbeitsplätzen, Auswertungen) strukturiert werden müssen, um eine effiziente Nutzung zu gewährleisten.</w:t>
+      </w:r>
+    </w:p>
+    <w:p>
+      <w:pPr>
+        <w:spacing w:before="100" w:beforeAutospacing="1" w:after="100" w:afterAutospacing="1"/>
+        <w:ind w:left="720"/>
+        <w:rPr>
+          <w:rFonts w:ascii="Arial" w:hAnsi="Arial" w:cs="Arial"/>
+          <w:color w:val="000000" w:themeColor="text1"/>
+        </w:rPr>
+      </w:pPr>
+    </w:p>
+    <w:p>
+      <w:pPr>
+        <w:spacing w:before="100" w:beforeAutospacing="1" w:after="100" w:afterAutospacing="1"/>
+        <w:outlineLvl w:val="1"/>
+        <w:rPr>
+          <w:rFonts w:ascii="Arial" w:hAnsi="Arial" w:cs="Arial"/>
+          <w:b/>
+          <w:bCs/>
+          <w:color w:val="000000" w:themeColor="text1"/>
+          <w:sz w:val="36"/>
+          <w:szCs w:val="36"/>
+        </w:rPr>
+      </w:pPr>
+      <w:r>
+        <w:rPr>
+          <w:rFonts w:ascii="Arial" w:hAnsi="Arial" w:cs="Arial"/>
+          <w:b/>
+          <w:bCs/>
+          <w:color w:val="000000" w:themeColor="text1"/>
+          <w:sz w:val="36"/>
+          <w:szCs w:val="36"/>
+        </w:rPr>
+        <w:t xml:space="preserve">Beide </w:t>
+      </w:r>
+      <w:r>
+        <w:rPr>
+          <w:rFonts w:ascii="Arial" w:hAnsi="Arial" w:cs="Arial"/>
+          <w:b/>
+          <w:bCs/>
+          <w:color w:val="000000" w:themeColor="text1"/>
+          <w:sz w:val="36"/>
+          <w:szCs w:val="36"/>
+        </w:rPr>
+        <w:t>Kandidaten:</w:t>
+      </w:r>
+    </w:p>
+    <w:p>
+      <w:pPr>
+        <w:numPr>
+          <w:ilvl w:val="0"/>
+          <w:numId w:val="2"/>
+        </w:numPr>
+        <w:spacing w:before="100" w:beforeAutospacing="1" w:after="100" w:afterAutospacing="1"/>
+        <w:rPr>
+          <w:rFonts w:ascii="Arial" w:hAnsi="Arial" w:cs="Arial"/>
+          <w:color w:val="000000" w:themeColor="text1"/>
+        </w:rPr>
+      </w:pPr>
+      <w:r>
+        <w:rPr>
+          <w:rFonts w:ascii="Arial" w:hAnsi="Arial" w:cs="Arial"/>
+          <w:color w:val="000000" w:themeColor="text1"/>
+        </w:rPr>
+        <w:t xml:space="preserve">Untersuchen, wie ein Backend-System zur Verwaltung von </w:t>
+      </w:r>
+      <w:proofErr w:type="spellStart"/>
+      <w:proofErr w:type="gramStart"/>
+      <w:r>
+        <w:rPr>
+          <w:rFonts w:ascii="Arial" w:hAnsi="Arial" w:cs="Arial"/>
+          <w:color w:val="000000" w:themeColor="text1"/>
+        </w:rPr>
+        <w:t>Benutzer:innen</w:t>
+      </w:r>
+      <w:proofErr w:type="spellEnd"/>
+      <w:proofErr w:type="gramEnd"/>
+      <w:r>
+        <w:rPr>
+          <w:rFonts w:ascii="Arial" w:hAnsi="Arial" w:cs="Arial"/>
+          <w:color w:val="000000" w:themeColor="text1"/>
+        </w:rPr>
+        <w:t>, Arbeitsplätzen und Reservierungen aufgebaut sein muss, um eine zuverlässige Nutzung zu ermöglichen.</w:t>
+      </w:r>
+    </w:p>
+    <w:p>
+      <w:pPr>
+        <w:numPr>
+          <w:ilvl w:val="0"/>
+          <w:numId w:val="1"/>
+        </w:numPr>
+        <w:spacing w:before="100" w:beforeAutospacing="1" w:after="100" w:afterAutospacing="1"/>
+        <w:rPr>
+          <w:rFonts w:ascii="Arial" w:hAnsi="Arial" w:cs="Arial"/>
+          <w:color w:val="000000" w:themeColor="text1"/>
+        </w:rPr>
+      </w:pPr>
+      <w:r>
+        <w:rPr>
+          <w:rFonts w:ascii="Arial" w:hAnsi="Arial" w:cs="Arial"/>
+          <w:color w:val="000000" w:themeColor="text1"/>
+        </w:rPr>
+        <w:lastRenderedPageBreak/>
+        <w:t>Prüfen, inwiefern eine visuelle bzw. spielerische Darstellung (z. B. mittels Pixelgrafik oder Avatar) sinnvoll in die Anwendung integriert werden kann und welchen Mehrwert diese bietet.</w:t>
+      </w:r>
+    </w:p>
+    <w:p>
+      <w:pPr>
+        <w:spacing w:before="100" w:beforeAutospacing="1" w:after="100" w:afterAutospacing="1"/>
+        <w:outlineLvl w:val="1"/>
+        <w:rPr>
+          <w:rFonts w:ascii="Arial" w:hAnsi="Arial" w:cs="Arial"/>
+          <w:b/>
+          <w:bCs/>
+          <w:color w:val="000000" w:themeColor="text1"/>
+          <w:sz w:val="36"/>
+          <w:szCs w:val="36"/>
+        </w:rPr>
+      </w:pPr>
+    </w:p>
+    <w:p>
+      <w:pPr>
+        <w:shd w:val="clear" w:color="auto" w:fill="FFFFFF"/>
+        <w:spacing w:after="213"/>
+        <w:outlineLvl w:val="2"/>
+        <w:rPr>
+          <w:rFonts w:ascii="Arial" w:hAnsi="Arial" w:cs="Arial"/>
+          <w:color w:val="000000" w:themeColor="text1"/>
+          <w:sz w:val="27"/>
+          <w:szCs w:val="27"/>
+        </w:rPr>
+      </w:pPr>
+      <w:r>
+        <w:rPr>
+          <w:rFonts w:ascii="Arial" w:hAnsi="Arial" w:cs="Arial"/>
+          <w:color w:val="000000" w:themeColor="text1"/>
+          <w:sz w:val="27"/>
+          <w:szCs w:val="27"/>
+        </w:rPr>
+        <w:t>Zielsetzung</w:t>
+      </w:r>
+      <w:r>
+        <w:rPr>
+          <w:rFonts w:ascii="Arial" w:hAnsi="Arial" w:cs="Arial"/>
+          <w:color w:val="000000" w:themeColor="text1"/>
+          <w:sz w:val="27"/>
+          <w:szCs w:val="27"/>
+        </w:rPr>
+        <w:t>:</w:t>
+      </w:r>
+    </w:p>
+    <w:p>
+      <w:pPr>
+        <w:pStyle w:val="s5"/>
+        <w:spacing w:before="0" w:beforeAutospacing="0" w:after="0" w:afterAutospacing="0"/>
+        <w:rPr>
+          <w:rFonts w:ascii="Arial" w:hAnsi="Arial" w:cs="Arial"/>
+          <w:color w:val="000000" w:themeColor="text1"/>
+        </w:rPr>
+      </w:pPr>
+      <w:r>
+        <w:rPr>
+          <w:rStyle w:val="s4"/>
+          <w:rFonts w:ascii="Arial" w:eastAsiaTheme="majorEastAsia" w:hAnsi="Arial" w:cs="Arial"/>
+          <w:color w:val="000000" w:themeColor="text1"/>
+        </w:rPr>
+        <w:t>Entwicklung eines webbasierten Systems zur Verwaltung und Reservierung von</w:t>
+      </w:r>
+    </w:p>
+    <w:p>
+      <w:pPr>
+        <w:pStyle w:val="s5"/>
+        <w:spacing w:before="0" w:beforeAutospacing="0" w:after="0" w:afterAutospacing="0"/>
+        <w:rPr>
+          <w:rFonts w:ascii="Arial" w:hAnsi="Arial" w:cs="Arial"/>
+          <w:color w:val="000000" w:themeColor="text1"/>
+        </w:rPr>
+      </w:pPr>
+      <w:r>
+        <w:rPr>
+          <w:rStyle w:val="s4"/>
+          <w:rFonts w:ascii="Arial" w:eastAsiaTheme="majorEastAsia" w:hAnsi="Arial" w:cs="Arial"/>
+          <w:color w:val="000000" w:themeColor="text1"/>
+        </w:rPr>
+        <w:t>Büroarbeitsplätzen. Das System soll eine intuitive Oberfläche</w:t>
+      </w:r>
+      <w:r>
+        <w:rPr>
+          <w:rStyle w:val="s4"/>
+          <w:rFonts w:ascii="Arial" w:eastAsiaTheme="majorEastAsia" w:hAnsi="Arial" w:cs="Arial"/>
+          <w:color w:val="000000" w:themeColor="text1"/>
+        </w:rPr>
+        <w:t xml:space="preserve"> </w:t>
+      </w:r>
+      <w:r>
+        <w:rPr>
+          <w:rStyle w:val="s4"/>
+          <w:rFonts w:ascii="Arial" w:eastAsiaTheme="majorEastAsia" w:hAnsi="Arial" w:cs="Arial"/>
+          <w:color w:val="000000" w:themeColor="text1"/>
+        </w:rPr>
+        <w:t>für</w:t>
+      </w:r>
+      <w:r>
+        <w:rPr>
+          <w:rStyle w:val="apple-converted-space"/>
+          <w:rFonts w:ascii="Arial" w:eastAsiaTheme="majorEastAsia" w:hAnsi="Arial" w:cs="Arial"/>
+          <w:color w:val="000000" w:themeColor="text1"/>
+        </w:rPr>
+        <w:t> </w:t>
+      </w:r>
+      <w:proofErr w:type="spellStart"/>
+      <w:proofErr w:type="gramStart"/>
+      <w:r>
+        <w:rPr>
+          <w:rStyle w:val="s4"/>
+          <w:rFonts w:ascii="Arial" w:eastAsiaTheme="majorEastAsia" w:hAnsi="Arial" w:cs="Arial"/>
+          <w:color w:val="000000" w:themeColor="text1"/>
+        </w:rPr>
+        <w:t>Endnutzer:innen</w:t>
+      </w:r>
+      <w:proofErr w:type="spellEnd"/>
+      <w:proofErr w:type="gramEnd"/>
+      <w:r>
+        <w:rPr>
+          <w:rStyle w:val="apple-converted-space"/>
+          <w:rFonts w:ascii="Arial" w:eastAsiaTheme="majorEastAsia" w:hAnsi="Arial" w:cs="Arial"/>
+          <w:color w:val="000000" w:themeColor="text1"/>
+        </w:rPr>
+        <w:t> </w:t>
+      </w:r>
+      <w:r>
+        <w:rPr>
+          <w:rStyle w:val="s4"/>
+          <w:rFonts w:ascii="Arial" w:eastAsiaTheme="majorEastAsia" w:hAnsi="Arial" w:cs="Arial"/>
+          <w:color w:val="000000" w:themeColor="text1"/>
+        </w:rPr>
+        <w:t>sowie eine</w:t>
+      </w:r>
+    </w:p>
+    <w:p>
+      <w:pPr>
+        <w:pStyle w:val="s5"/>
+        <w:spacing w:before="0" w:beforeAutospacing="0" w:after="0" w:afterAutospacing="0"/>
+        <w:rPr>
+          <w:rFonts w:ascii="Arial" w:hAnsi="Arial" w:cs="Arial"/>
+          <w:color w:val="000000" w:themeColor="text1"/>
+        </w:rPr>
+      </w:pPr>
+      <w:r>
+        <w:rPr>
+          <w:rStyle w:val="s4"/>
+          <w:rFonts w:ascii="Arial" w:eastAsiaTheme="majorEastAsia" w:hAnsi="Arial" w:cs="Arial"/>
+          <w:color w:val="000000" w:themeColor="text1"/>
+        </w:rPr>
+        <w:t>Administrations-Oberfläche für die Verwaltung bieten.</w:t>
+      </w:r>
+    </w:p>
+    <w:p>
+      <w:pPr>
+        <w:spacing w:before="100" w:beforeAutospacing="1" w:after="100" w:afterAutospacing="1"/>
+        <w:outlineLvl w:val="1"/>
+        <w:rPr>
+          <w:rFonts w:ascii="Arial" w:hAnsi="Arial" w:cs="Arial"/>
+          <w:b/>
+          <w:bCs/>
+          <w:color w:val="000000" w:themeColor="text1"/>
+          <w:sz w:val="36"/>
+          <w:szCs w:val="36"/>
+        </w:rPr>
+      </w:pPr>
+    </w:p>
+    <w:p>
+      <w:pPr>
+        <w:pStyle w:val="berschrift3"/>
+        <w:shd w:val="clear" w:color="auto" w:fill="FFFFFF"/>
+        <w:spacing w:before="0" w:after="213"/>
+        <w:rPr>
+          <w:rFonts w:ascii="Arial" w:hAnsi="Arial" w:cs="Arial"/>
+          <w:color w:val="333333"/>
+        </w:rPr>
+      </w:pPr>
+      <w:r>
+        <w:rPr>
+          <w:rFonts w:ascii="Arial" w:hAnsi="Arial" w:cs="Arial"/>
+          <w:color w:val="333333"/>
+        </w:rPr>
+        <w:t>Geplantes Ergebnis der Prüfungskandidatin/des Prüfungskandidaten</w:t>
+      </w:r>
+      <w:r>
+        <w:rPr>
+          <w:rFonts w:ascii="Arial" w:hAnsi="Arial" w:cs="Arial"/>
+          <w:color w:val="333333"/>
+        </w:rPr>
+        <w:t>:</w:t>
+      </w:r>
+    </w:p>
+    <w:p>
+      <w:pPr>
+        <w:spacing w:before="100" w:beforeAutospacing="1" w:after="100" w:afterAutospacing="1"/>
+        <w:outlineLvl w:val="1"/>
+        <w:rPr>
+          <w:rFonts w:ascii="Arial" w:hAnsi="Arial" w:cs="Arial"/>
+          <w:b/>
+          <w:bCs/>
+          <w:color w:val="000000" w:themeColor="text1"/>
+          <w:sz w:val="36"/>
+          <w:szCs w:val="36"/>
+        </w:rPr>
+      </w:pPr>
+      <w:r>
+        <w:rPr>
+          <w:rFonts w:ascii="Arial" w:hAnsi="Arial" w:cs="Arial"/>
+          <w:b/>
+          <w:bCs/>
+          <w:color w:val="000000" w:themeColor="text1"/>
+          <w:sz w:val="36"/>
+          <w:szCs w:val="36"/>
+        </w:rPr>
+        <w:t>Deniz Bernecker</w:t>
+      </w:r>
+      <w:r>
+        <w:rPr>
+          <w:rFonts w:ascii="Arial" w:hAnsi="Arial" w:cs="Arial"/>
+          <w:b/>
+          <w:bCs/>
+          <w:color w:val="000000" w:themeColor="text1"/>
+          <w:sz w:val="36"/>
+          <w:szCs w:val="36"/>
+        </w:rPr>
+        <w:t>:</w:t>
+      </w:r>
+    </w:p>
+    <w:p>
+      <w:pPr>
+        <w:numPr>
+          <w:ilvl w:val="0"/>
+          <w:numId w:val="3"/>
+        </w:numPr>
+        <w:spacing w:before="100" w:beforeAutospacing="1" w:after="100" w:afterAutospacing="1"/>
+        <w:rPr>
+          <w:rFonts w:ascii="Arial" w:hAnsi="Arial" w:cs="Arial"/>
+          <w:color w:val="000000" w:themeColor="text1"/>
+        </w:rPr>
+      </w:pPr>
+      <w:r>
+        <w:rPr>
+          <w:rFonts w:ascii="Arial" w:hAnsi="Arial" w:cs="Arial"/>
+          <w:color w:val="000000" w:themeColor="text1"/>
+        </w:rPr>
+        <w:t>Umsetzung einer übersichtlichen und benutzerfreundlichen Darstellung der Büroarbeitsplätze in Vogelperspektive, die eine schnelle Orientierung und einfache Auswahl ermöglicht.</w:t>
+      </w:r>
+    </w:p>
+    <w:p>
+      <w:pPr>
+        <w:numPr>
+          <w:ilvl w:val="0"/>
+          <w:numId w:val="3"/>
+        </w:numPr>
+        <w:spacing w:before="100" w:beforeAutospacing="1" w:after="100" w:afterAutospacing="1"/>
+        <w:rPr>
+          <w:rFonts w:ascii="Arial" w:hAnsi="Arial" w:cs="Arial"/>
+          <w:color w:val="000000" w:themeColor="text1"/>
+        </w:rPr>
+      </w:pPr>
+      <w:r>
+        <w:rPr>
+          <w:rFonts w:ascii="Arial" w:hAnsi="Arial" w:cs="Arial"/>
+          <w:color w:val="000000" w:themeColor="text1"/>
+        </w:rPr>
+        <w:t>Implementierung einer interaktiven Weboberfläche unter Verwendung geeigneter Technologien zur effizienten Umsetzung der Benutzeroberfläche.</w:t>
+      </w:r>
+    </w:p>
+    <w:p>
+      <w:pPr>
+        <w:numPr>
+          <w:ilvl w:val="0"/>
+          <w:numId w:val="3"/>
+        </w:numPr>
+        <w:spacing w:before="100" w:beforeAutospacing="1" w:after="100" w:afterAutospacing="1"/>
+        <w:rPr>
+          <w:rFonts w:ascii="Arial" w:hAnsi="Arial" w:cs="Arial"/>
+          <w:color w:val="000000" w:themeColor="text1"/>
+        </w:rPr>
+      </w:pPr>
+      <w:r>
+        <w:rPr>
+          <w:rFonts w:ascii="Arial" w:hAnsi="Arial" w:cs="Arial"/>
+          <w:color w:val="000000" w:themeColor="text1"/>
+        </w:rPr>
+        <w:t>Entwicklung einer intuitiven Interaktion mit Arbeitsplätzen, sodass Informationen klar dargestellt und Reservierungen ohne Einschulung durchgeführt werden können.</w:t>
+      </w:r>
+    </w:p>
+    <w:p>
+      <w:pPr>
+        <w:rPr>
+          <w:rFonts w:ascii="Arial" w:hAnsi="Arial" w:cs="Arial"/>
+          <w:color w:val="000000" w:themeColor="text1"/>
+        </w:rPr>
+      </w:pPr>
+    </w:p>
+    <w:p>
+      <w:pPr>
+        <w:spacing w:before="100" w:beforeAutospacing="1" w:after="100" w:afterAutospacing="1"/>
+        <w:outlineLvl w:val="1"/>
+        <w:rPr>
+          <w:rFonts w:ascii="Arial" w:hAnsi="Arial" w:cs="Arial"/>
+          <w:b/>
+          <w:bCs/>
+          <w:color w:val="000000" w:themeColor="text1"/>
+          <w:sz w:val="36"/>
+          <w:szCs w:val="36"/>
+        </w:rPr>
+      </w:pPr>
+      <w:r>
+        <w:rPr>
+          <w:rFonts w:ascii="Arial" w:hAnsi="Arial" w:cs="Arial"/>
+          <w:b/>
+          <w:bCs/>
+          <w:color w:val="000000" w:themeColor="text1"/>
+          <w:sz w:val="36"/>
+          <w:szCs w:val="36"/>
+        </w:rPr>
+        <w:t>Nico Hofer</w:t>
+      </w:r>
+      <w:r>
+        <w:rPr>
+          <w:rFonts w:ascii="Arial" w:hAnsi="Arial" w:cs="Arial"/>
+          <w:b/>
+          <w:bCs/>
+          <w:color w:val="000000" w:themeColor="text1"/>
+          <w:sz w:val="36"/>
+          <w:szCs w:val="36"/>
+        </w:rPr>
+        <w:t>:</w:t>
+      </w:r>
+    </w:p>
+    <w:p>
+      <w:pPr>
+        <w:numPr>
+          <w:ilvl w:val="0"/>
+          <w:numId w:val="4"/>
+        </w:numPr>
+        <w:spacing w:before="100" w:beforeAutospacing="1" w:after="100" w:afterAutospacing="1"/>
+        <w:rPr>
+          <w:rFonts w:ascii="Arial" w:hAnsi="Arial" w:cs="Arial"/>
+          <w:color w:val="000000" w:themeColor="text1"/>
+        </w:rPr>
+      </w:pPr>
+      <w:r>
+        <w:rPr>
+          <w:rFonts w:ascii="Arial" w:hAnsi="Arial" w:cs="Arial"/>
+          <w:color w:val="000000" w:themeColor="text1"/>
+        </w:rPr>
+        <w:t>Umsetzung einer geeigneten Datenbankstruktur zur Verwaltung von Arbeitsplätzen, Buchungen und statistischen Auswertungen.</w:t>
+      </w:r>
+    </w:p>
+    <w:p>
+      <w:pPr>
+        <w:numPr>
+          <w:ilvl w:val="0"/>
+          <w:numId w:val="4"/>
+        </w:numPr>
+        <w:spacing w:before="100" w:beforeAutospacing="1" w:after="100" w:afterAutospacing="1"/>
+        <w:rPr>
+          <w:rFonts w:ascii="Arial" w:hAnsi="Arial" w:cs="Arial"/>
+          <w:color w:val="000000" w:themeColor="text1"/>
+        </w:rPr>
+      </w:pPr>
+      <w:r>
+        <w:rPr>
+          <w:rFonts w:ascii="Arial" w:hAnsi="Arial" w:cs="Arial"/>
+          <w:color w:val="000000" w:themeColor="text1"/>
+        </w:rPr>
+        <w:t>Implementierung einer Authentifizierungs- und Benutzerverwaltungslösung mit Testdaten, um ein realistisches Nutzungsszenario ohne reale Unternehmensdaten zu ermöglichen.</w:t>
+      </w:r>
+    </w:p>
+    <w:p>
+      <w:pPr>
+        <w:numPr>
+          <w:ilvl w:val="0"/>
+          <w:numId w:val="4"/>
+        </w:numPr>
+        <w:spacing w:before="100" w:beforeAutospacing="1" w:after="100" w:afterAutospacing="1"/>
+        <w:rPr>
+          <w:rFonts w:ascii="Arial" w:hAnsi="Arial" w:cs="Arial"/>
+          <w:color w:val="000000" w:themeColor="text1"/>
+        </w:rPr>
+      </w:pPr>
+      <w:r>
+        <w:rPr>
+          <w:rFonts w:ascii="Arial" w:hAnsi="Arial" w:cs="Arial"/>
+          <w:color w:val="000000" w:themeColor="text1"/>
+        </w:rPr>
+        <w:t>Entwicklung einer Admin-Oberfläche zur Verwaltung von Arbeitsplätzen und zur Durchführung von Auswertungen.</w:t>
+      </w:r>
+    </w:p>
+    <w:p>
+      <w:pPr>
+        <w:rPr>
+          <w:rFonts w:ascii="Arial" w:hAnsi="Arial" w:cs="Arial"/>
+          <w:color w:val="000000" w:themeColor="text1"/>
+        </w:rPr>
+      </w:pPr>
+    </w:p>
+    <w:p>
+      <w:pPr>
+        <w:spacing w:before="100" w:beforeAutospacing="1" w:after="100" w:afterAutospacing="1"/>
+        <w:outlineLvl w:val="1"/>
+        <w:rPr>
+          <w:rFonts w:ascii="Arial" w:hAnsi="Arial" w:cs="Arial"/>
+          <w:b/>
+          <w:bCs/>
+          <w:color w:val="000000" w:themeColor="text1"/>
+          <w:sz w:val="36"/>
+          <w:szCs w:val="36"/>
+        </w:rPr>
+      </w:pPr>
+      <w:r>
+        <w:rPr>
+          <w:rFonts w:ascii="Arial" w:hAnsi="Arial" w:cs="Arial"/>
+          <w:b/>
+          <w:bCs/>
+          <w:color w:val="000000" w:themeColor="text1"/>
+          <w:sz w:val="36"/>
+          <w:szCs w:val="36"/>
+        </w:rPr>
+        <w:t>Beide Kandidaten</w:t>
+      </w:r>
+      <w:r>
+        <w:rPr>
+          <w:rFonts w:ascii="Arial" w:hAnsi="Arial" w:cs="Arial"/>
+          <w:b/>
+          <w:bCs/>
+          <w:color w:val="000000" w:themeColor="text1"/>
+          <w:sz w:val="36"/>
+          <w:szCs w:val="36"/>
+        </w:rPr>
+        <w:t>:</w:t>
+      </w:r>
+    </w:p>
+    <w:p>
+      <w:pPr>
+        <w:numPr>
+          <w:ilvl w:val="0"/>
+          <w:numId w:val="5"/>
+        </w:numPr>
+        <w:spacing w:before="100" w:beforeAutospacing="1" w:after="100" w:afterAutospacing="1"/>
+        <w:rPr>
+          <w:rFonts w:ascii="Arial" w:hAnsi="Arial" w:cs="Arial"/>
+          <w:color w:val="000000" w:themeColor="text1"/>
+        </w:rPr>
+      </w:pPr>
+      <w:r>
+        <w:rPr>
+          <w:rFonts w:ascii="Arial" w:hAnsi="Arial" w:cs="Arial"/>
+          <w:color w:val="000000" w:themeColor="text1"/>
+        </w:rPr>
+        <w:t xml:space="preserve">Umsetzung eines Backend-Systems zur Verwaltung von </w:t>
+      </w:r>
+      <w:proofErr w:type="spellStart"/>
+      <w:proofErr w:type="gramStart"/>
+      <w:r>
+        <w:rPr>
+          <w:rFonts w:ascii="Arial" w:hAnsi="Arial" w:cs="Arial"/>
+          <w:color w:val="000000" w:themeColor="text1"/>
+        </w:rPr>
+        <w:t>Benutzer:innen</w:t>
+      </w:r>
+      <w:proofErr w:type="spellEnd"/>
+      <w:proofErr w:type="gramEnd"/>
+      <w:r>
+        <w:rPr>
+          <w:rFonts w:ascii="Arial" w:hAnsi="Arial" w:cs="Arial"/>
+          <w:color w:val="000000" w:themeColor="text1"/>
+        </w:rPr>
+        <w:t>, Arbeitsplätzen und Reservierungen, das eine zuverlässige Nutzung ermöglicht.</w:t>
+      </w:r>
+    </w:p>
+    <w:p>
+      <w:pPr>
+        <w:numPr>
+          <w:ilvl w:val="0"/>
+          <w:numId w:val="5"/>
+        </w:numPr>
+        <w:spacing w:before="100" w:beforeAutospacing="1" w:after="100" w:afterAutospacing="1"/>
+        <w:rPr>
+          <w:rFonts w:ascii="Arial" w:hAnsi="Arial" w:cs="Arial"/>
+          <w:color w:val="000000" w:themeColor="text1"/>
+        </w:rPr>
+      </w:pPr>
+      <w:r>
+        <w:rPr>
+          <w:rFonts w:ascii="Arial" w:hAnsi="Arial" w:cs="Arial"/>
+          <w:color w:val="000000" w:themeColor="text1"/>
+        </w:rPr>
+        <w:t>Integration einer visuellen bzw. spielerischen Darstellung (z. B. Pixelgrafik oder Avatar), um die Anwendung interaktiver zu gestalten</w:t>
+      </w:r>
+      <w:r>
+        <w:rPr>
+          <w:rFonts w:ascii="Arial" w:hAnsi="Arial" w:cs="Arial"/>
+          <w:color w:val="000000" w:themeColor="text1"/>
+        </w:rPr>
+        <w:t>.</w:t>
+      </w:r>
+    </w:p>
+    <w:p>
+      <w:pPr>
+        <w:spacing w:before="100" w:beforeAutospacing="1" w:after="100" w:afterAutospacing="1"/>
+        <w:outlineLvl w:val="1"/>
+        <w:rPr>
+          <w:rFonts w:ascii="Arial" w:hAnsi="Arial" w:cs="Arial"/>
+          <w:b/>
+          <w:bCs/>
+          <w:color w:val="000000" w:themeColor="text1"/>
+          <w:sz w:val="36"/>
+          <w:szCs w:val="36"/>
+        </w:rPr>
+      </w:pPr>
+      <w:r>
+        <w:rPr>
+          <w:rFonts w:ascii="Arial" w:hAnsi="Arial" w:cs="Arial"/>
+          <w:b/>
+          <w:bCs/>
+          <w:color w:val="000000" w:themeColor="text1"/>
+          <w:sz w:val="36"/>
+          <w:szCs w:val="36"/>
+        </w:rPr>
+        <w:lastRenderedPageBreak/>
+        <w:t>Kostenschätzung</w:t>
+      </w:r>
+    </w:p>
+    <w:p>
+      <w:pPr>
+        <w:spacing w:before="100" w:beforeAutospacing="1" w:after="100" w:afterAutospacing="1"/>
+        <w:rPr>
+          <w:rFonts w:ascii="Arial" w:hAnsi="Arial" w:cs="Arial"/>
+          <w:color w:val="000000" w:themeColor="text1"/>
+        </w:rPr>
+      </w:pPr>
+      <w:r>
+        <w:rPr>
+          <w:rFonts w:ascii="Arial" w:hAnsi="Arial" w:cs="Arial"/>
+          <w:color w:val="000000" w:themeColor="text1"/>
+        </w:rPr>
+        <w:t>Maximale Kosten: 0 €</w:t>
+      </w:r>
+      <w:r>
+        <w:rPr>
+          <w:rFonts w:ascii="Arial" w:hAnsi="Arial" w:cs="Arial"/>
+          <w:color w:val="000000" w:themeColor="text1"/>
+        </w:rPr>
+        <w:br/>
+        <w:t>Es werden ausschließlich vorhandene Entwicklungsumgebungen und Softwarelösungen verwendet, wodurch keine zusätzlichen Kosten entstehen.</w:t>
+      </w:r>
+    </w:p>
+    <w:p>
+      <w:pPr>
+        <w:shd w:val="clear" w:color="auto" w:fill="FFFFFF"/>
+        <w:spacing w:after="213"/>
+        <w:outlineLvl w:val="2"/>
+        <w:rPr>
+          <w:rFonts w:ascii="Arial" w:hAnsi="Arial" w:cs="Arial"/>
+          <w:color w:val="000000" w:themeColor="text1"/>
+          <w:sz w:val="27"/>
+          <w:szCs w:val="27"/>
+        </w:rPr>
+      </w:pPr>
+    </w:p>
+    <w:p>
+      <w:pPr>
+        <w:shd w:val="clear" w:color="auto" w:fill="FFFFFF"/>
+        <w:spacing w:after="213"/>
+        <w:outlineLvl w:val="2"/>
+        <w:rPr>
+          <w:rFonts w:ascii="Arial" w:hAnsi="Arial" w:cs="Arial"/>
+          <w:color w:val="000000" w:themeColor="text1"/>
+          <w:sz w:val="27"/>
+          <w:szCs w:val="27"/>
+        </w:rPr>
+      </w:pPr>
     </w:p>
     <w:sectPr>
-      <w:headerReference w:type="default" r:id="rId6"/>
+      <w:headerReference w:type="default" r:id="rId7"/>
       <w:pgSz w:w="11906" w:h="16838"/>
       <w:pgMar w:top="1417" w:right="1417" w:bottom="1134" w:left="1417" w:header="708" w:footer="708" w:gutter="0"/>
       <w:cols w:space="708"/>
@@ -92,9 +1120,6 @@
 <w:endnotes xmlns:wpc="http://schemas.microsoft.com/office/word/2010/wordprocessingCanvas" xmlns:cx="http://schemas.microsoft.com/office/drawing/2014/chartex" xmlns:cx1="http://schemas.microsoft.com/office/drawing/2015/9/8/chartex" xmlns:cx2="http://schemas.microsoft.com/office/drawing/2015/10/21/chartex" xmlns:cx3="http://schemas.microsoft.com/office/drawing/2016/5/9/chartex" xmlns:cx4="http://schemas.microsoft.com/office/drawing/2016/5/10/chartex" xmlns:cx5="http://schemas.microsoft.com/office/drawing/2016/5/11/chartex" xmlns:cx6="http://schemas.microsoft.com/office/drawing/2016/5/12/chartex" xmlns:cx7="http://schemas.microsoft.com/office/drawing/2016/5/13/chartex" xmlns:cx8="http://schemas.microsoft.com/office/drawing/2016/5/14/chartex" xmlns:mc="http://schemas.openxmlformats.org/markup-compatibility/2006" xmlns:aink="http://schemas.microsoft.com/office/drawing/2016/ink" xmlns:am3d="http://schemas.microsoft.com/office/drawing/2017/model3d" xmlns:o="urn:schemas-microsoft-com:office:office" xmlns:oel="http://schemas.microsoft.com/office/2019/extlst" xmlns:r="http://schemas.openxmlformats.org/officeDocument/2006/relationships" xmlns:m="http://schemas.openxmlformats.org/officeDocument/2006/math" xmlns:v="urn:schemas-microsoft-com:vml" xmlns:wp14="http://schemas.microsoft.com/office/word/2010/wordprocessingDrawing" xmlns:wp="http://schemas.openxmlformats.org/drawingml/2006/wordprocessingDrawing" xmlns:w10="urn:schemas-microsoft-com:office:word" xmlns:w="http://schemas.openxmlformats.org/wordprocessingml/2006/main" xmlns:w14="http://schemas.microsoft.com/office/word/2010/wordml" xmlns:w15="http://schemas.microsoft.com/office/word/2012/wordml" xmlns:w16cex="http://schemas.microsoft.com/office/word/2018/wordml/cex" xmlns:w16cid="http://schemas.microsoft.com/office/word/2016/wordml/cid" xmlns:w16="http://schemas.microsoft.com/office/word/2018/wordml" xmlns:w16du="http://schemas.microsoft.com/office/word/2023/wordml/word16du" xmlns:w16sdtdh="http://schemas.microsoft.com/office/word/2020/wordml/sdtdatahash" xmlns:w16sdtfl="http://schemas.microsoft.com/office/word/2024/wordml/sdtformatlock" xmlns:w16se="http://schemas.microsoft.com/office/word/2015/wordml/symex" xmlns:wpg="http://schemas.microsoft.com/office/word/2010/wordprocessingGroup" xmlns:wpi="http://schemas.microsoft.com/office/word/2010/wordprocessingInk" xmlns:wne="http://schemas.microsoft.com/office/word/2006/wordml" xmlns:wps="http://schemas.microsoft.com/office/word/2010/wordprocessingShape" mc:Ignorable="w14 w15 w16se w16cid w16 w16cex w16sdtdh w16sdtfl w16du wp14">
   <w:endnote w:type="separator" w:id="-1">
     <w:p>
-      <w:pPr>
-        <w:spacing w:after="0" w:line="240" w:lineRule="auto"/>
-      </w:pPr>
       <w:r>
         <w:separator/>
       </w:r>
@@ -102,9 +1127,6 @@
   </w:endnote>
   <w:endnote w:type="continuationSeparator" w:id="0">
     <w:p>
-      <w:pPr>
-        <w:spacing w:after="0" w:line="240" w:lineRule="auto"/>
-      </w:pPr>
       <w:r>
         <w:continuationSeparator/>
       </w:r>
@@ -117,9 +1139,6 @@
 <w:footnotes xmlns:wpc="http://schemas.microsoft.com/office/word/2010/wordprocessingCanvas" xmlns:cx="http://schemas.microsoft.com/office/drawing/2014/chartex" xmlns:cx1="http://schemas.microsoft.com/office/drawing/2015/9/8/chartex" xmlns:cx2="http://schemas.microsoft.com/office/drawing/2015/10/21/chartex" xmlns:cx3="http://schemas.microsoft.com/office/drawing/2016/5/9/chartex" xmlns:cx4="http://schemas.microsoft.com/office/drawing/2016/5/10/chartex" xmlns:cx5="http://schemas.microsoft.com/office/drawing/2016/5/11/chartex" xmlns:cx6="http://schemas.microsoft.com/office/drawing/2016/5/12/chartex" xmlns:cx7="http://schemas.microsoft.com/office/drawing/2016/5/13/chartex" xmlns:cx8="http://schemas.microsoft.com/office/drawing/2016/5/14/chartex" xmlns:mc="http://schemas.openxmlformats.org/markup-compatibility/2006" xmlns:aink="http://schemas.microsoft.com/office/drawing/2016/ink" xmlns:am3d="http://schemas.microsoft.com/office/drawing/2017/model3d" xmlns:o="urn:schemas-microsoft-com:office:office" xmlns:oel="http://schemas.microsoft.com/office/2019/extlst" xmlns:r="http://schemas.openxmlformats.org/officeDocument/2006/relationships" xmlns:m="http://schemas.openxmlformats.org/officeDocument/2006/math" xmlns:v="urn:schemas-microsoft-com:vml" xmlns:wp14="http://schemas.microsoft.com/office/word/2010/wordprocessingDrawing" xmlns:wp="http://schemas.openxmlformats.org/drawingml/2006/wordprocessingDrawing" xmlns:w10="urn:schemas-microsoft-com:office:word" xmlns:w="http://schemas.openxmlformats.org/wordprocessingml/2006/main" xmlns:w14="http://schemas.microsoft.com/office/word/2010/wordml" xmlns:w15="http://schemas.microsoft.com/office/word/2012/wordml" xmlns:w16cex="http://schemas.microsoft.com/office/word/2018/wordml/cex" xmlns:w16cid="http://schemas.microsoft.com/office/word/2016/wordml/cid" xmlns:w16="http://schemas.microsoft.com/office/word/2018/wordml" xmlns:w16du="http://schemas.microsoft.com/office/word/2023/wordml/word16du" xmlns:w16sdtdh="http://schemas.microsoft.com/office/word/2020/wordml/sdtdatahash" xmlns:w16sdtfl="http://schemas.microsoft.com/office/word/2024/wordml/sdtformatlock" xmlns:w16se="http://schemas.microsoft.com/office/word/2015/wordml/symex" xmlns:wpg="http://schemas.microsoft.com/office/word/2010/wordprocessingGroup" xmlns:wpi="http://schemas.microsoft.com/office/word/2010/wordprocessingInk" xmlns:wne="http://schemas.microsoft.com/office/word/2006/wordml" xmlns:wps="http://schemas.microsoft.com/office/word/2010/wordprocessingShape" mc:Ignorable="w14 w15 w16se w16cid w16 w16cex w16sdtdh w16sdtfl w16du wp14">
   <w:footnote w:type="separator" w:id="-1">
     <w:p>
-      <w:pPr>
-        <w:spacing w:after="0" w:line="240" w:lineRule="auto"/>
-      </w:pPr>
       <w:r>
         <w:separator/>
       </w:r>
@@ -127,9 +1146,6 @@
   </w:footnote>
   <w:footnote w:type="continuationSeparator" w:id="0">
     <w:p>
-      <w:pPr>
-        <w:spacing w:after="0" w:line="240" w:lineRule="auto"/>
-      </w:pPr>
       <w:r>
         <w:continuationSeparator/>
       </w:r>
@@ -157,6 +1173,771 @@
     </w:r>
   </w:p>
 </w:hdr>
+</file>
+
+<file path=word/numbering.xml><?xml version="1.0" encoding="utf-8"?>
+<w:numbering xmlns:wpc="http://schemas.microsoft.com/office/word/2010/wordprocessingCanvas" xmlns:cx="http://schemas.microsoft.com/office/drawing/2014/chartex" xmlns:cx1="http://schemas.microsoft.com/office/drawing/2015/9/8/chartex" xmlns:cx2="http://schemas.microsoft.com/office/drawing/2015/10/21/chartex" xmlns:cx3="http://schemas.microsoft.com/office/drawing/2016/5/9/chartex" xmlns:cx4="http://schemas.microsoft.com/office/drawing/2016/5/10/chartex" xmlns:cx5="http://schemas.microsoft.com/office/drawing/2016/5/11/chartex" xmlns:cx6="http://schemas.microsoft.com/office/drawing/2016/5/12/chartex" xmlns:cx7="http://schemas.microsoft.com/office/drawing/2016/5/13/chartex" xmlns:cx8="http://schemas.microsoft.com/office/drawing/2016/5/14/chartex" xmlns:mc="http://schemas.openxmlformats.org/markup-compatibility/2006" xmlns:aink="http://schemas.microsoft.com/office/drawing/2016/ink" xmlns:am3d="http://schemas.microsoft.com/office/drawing/2017/model3d" xmlns:o="urn:schemas-microsoft-com:office:office" xmlns:oel="http://schemas.microsoft.com/office/2019/extlst" xmlns:r="http://schemas.openxmlformats.org/officeDocument/2006/relationships" xmlns:m="http://schemas.openxmlformats.org/officeDocument/2006/math" xmlns:v="urn:schemas-microsoft-com:vml" xmlns:wp14="http://schemas.microsoft.com/office/word/2010/wordprocessingDrawing" xmlns:wp="http://schemas.openxmlformats.org/drawingml/2006/wordprocessingDrawing" xmlns:w10="urn:schemas-microsoft-com:office:word" xmlns:w="http://schemas.openxmlformats.org/wordprocessingml/2006/main" xmlns:w14="http://schemas.microsoft.com/office/word/2010/wordml" xmlns:w15="http://schemas.microsoft.com/office/word/2012/wordml" xmlns:w16cex="http://schemas.microsoft.com/office/word/2018/wordml/cex" xmlns:w16cid="http://schemas.microsoft.com/office/word/2016/wordml/cid" xmlns:w16="http://schemas.microsoft.com/office/word/2018/wordml" xmlns:w16du="http://schemas.microsoft.com/office/word/2023/wordml/word16du" xmlns:w16sdtdh="http://schemas.microsoft.com/office/word/2020/wordml/sdtdatahash" xmlns:w16sdtfl="http://schemas.microsoft.com/office/word/2024/wordml/sdtformatlock" xmlns:w16se="http://schemas.microsoft.com/office/word/2015/wordml/symex" xmlns:wpg="http://schemas.microsoft.com/office/word/2010/wordprocessingGroup" xmlns:wpi="http://schemas.microsoft.com/office/word/2010/wordprocessingInk" xmlns:wne="http://schemas.microsoft.com/office/word/2006/wordml" xmlns:wps="http://schemas.microsoft.com/office/word/2010/wordprocessingShape" mc:Ignorable="w14 w15 w16se w16cid w16 w16cex w16sdtdh w16sdtfl w16du wp14">
+  <w:abstractNum w:abstractNumId="0" w15:restartNumberingAfterBreak="0">
+    <w:nsid w:val="0BBC6C79"/>
+    <w:multiLevelType w:val="multilevel"/>
+    <w:tmpl w:val="E42E479A"/>
+    <w:lvl w:ilvl="0">
+      <w:start w:val="1"/>
+      <w:numFmt w:val="bullet"/>
+      <w:lvlText w:val=""/>
+      <w:lvlJc w:val="left"/>
+      <w:pPr>
+        <w:tabs>
+          <w:tab w:val="num" w:pos="720"/>
+        </w:tabs>
+        <w:ind w:left="720" w:hanging="360"/>
+      </w:pPr>
+      <w:rPr>
+        <w:rFonts w:ascii="Symbol" w:hAnsi="Symbol" w:hint="default"/>
+        <w:sz w:val="20"/>
+      </w:rPr>
+    </w:lvl>
+    <w:lvl w:ilvl="1" w:tentative="1">
+      <w:start w:val="1"/>
+      <w:numFmt w:val="bullet"/>
+      <w:lvlText w:val="o"/>
+      <w:lvlJc w:val="left"/>
+      <w:pPr>
+        <w:tabs>
+          <w:tab w:val="num" w:pos="1440"/>
+        </w:tabs>
+        <w:ind w:left="1440" w:hanging="360"/>
+      </w:pPr>
+      <w:rPr>
+        <w:rFonts w:ascii="Courier New" w:hAnsi="Courier New" w:hint="default"/>
+        <w:sz w:val="20"/>
+      </w:rPr>
+    </w:lvl>
+    <w:lvl w:ilvl="2" w:tentative="1">
+      <w:start w:val="1"/>
+      <w:numFmt w:val="bullet"/>
+      <w:lvlText w:val=""/>
+      <w:lvlJc w:val="left"/>
+      <w:pPr>
+        <w:tabs>
+          <w:tab w:val="num" w:pos="2160"/>
+        </w:tabs>
+        <w:ind w:left="2160" w:hanging="360"/>
+      </w:pPr>
+      <w:rPr>
+        <w:rFonts w:ascii="Wingdings" w:hAnsi="Wingdings" w:hint="default"/>
+        <w:sz w:val="20"/>
+      </w:rPr>
+    </w:lvl>
+    <w:lvl w:ilvl="3" w:tentative="1">
+      <w:start w:val="1"/>
+      <w:numFmt w:val="bullet"/>
+      <w:lvlText w:val=""/>
+      <w:lvlJc w:val="left"/>
+      <w:pPr>
+        <w:tabs>
+          <w:tab w:val="num" w:pos="2880"/>
+        </w:tabs>
+        <w:ind w:left="2880" w:hanging="360"/>
+      </w:pPr>
+      <w:rPr>
+        <w:rFonts w:ascii="Wingdings" w:hAnsi="Wingdings" w:hint="default"/>
+        <w:sz w:val="20"/>
+      </w:rPr>
+    </w:lvl>
+    <w:lvl w:ilvl="4" w:tentative="1">
+      <w:start w:val="1"/>
+      <w:numFmt w:val="bullet"/>
+      <w:lvlText w:val=""/>
+      <w:lvlJc w:val="left"/>
+      <w:pPr>
+        <w:tabs>
+          <w:tab w:val="num" w:pos="3600"/>
+        </w:tabs>
+        <w:ind w:left="3600" w:hanging="360"/>
+      </w:pPr>
+      <w:rPr>
+        <w:rFonts w:ascii="Wingdings" w:hAnsi="Wingdings" w:hint="default"/>
+        <w:sz w:val="20"/>
+      </w:rPr>
+    </w:lvl>
+    <w:lvl w:ilvl="5" w:tentative="1">
+      <w:start w:val="1"/>
+      <w:numFmt w:val="bullet"/>
+      <w:lvlText w:val=""/>
+      <w:lvlJc w:val="left"/>
+      <w:pPr>
+        <w:tabs>
+          <w:tab w:val="num" w:pos="4320"/>
+        </w:tabs>
+        <w:ind w:left="4320" w:hanging="360"/>
+      </w:pPr>
+      <w:rPr>
+        <w:rFonts w:ascii="Wingdings" w:hAnsi="Wingdings" w:hint="default"/>
+        <w:sz w:val="20"/>
+      </w:rPr>
+    </w:lvl>
+    <w:lvl w:ilvl="6" w:tentative="1">
+      <w:start w:val="1"/>
+      <w:numFmt w:val="bullet"/>
+      <w:lvlText w:val=""/>
+      <w:lvlJc w:val="left"/>
+      <w:pPr>
+        <w:tabs>
+          <w:tab w:val="num" w:pos="5040"/>
+        </w:tabs>
+        <w:ind w:left="5040" w:hanging="360"/>
+      </w:pPr>
+      <w:rPr>
+        <w:rFonts w:ascii="Wingdings" w:hAnsi="Wingdings" w:hint="default"/>
+        <w:sz w:val="20"/>
+      </w:rPr>
+    </w:lvl>
+    <w:lvl w:ilvl="7" w:tentative="1">
+      <w:start w:val="1"/>
+      <w:numFmt w:val="bullet"/>
+      <w:lvlText w:val=""/>
+      <w:lvlJc w:val="left"/>
+      <w:pPr>
+        <w:tabs>
+          <w:tab w:val="num" w:pos="5760"/>
+        </w:tabs>
+        <w:ind w:left="5760" w:hanging="360"/>
+      </w:pPr>
+      <w:rPr>
+        <w:rFonts w:ascii="Wingdings" w:hAnsi="Wingdings" w:hint="default"/>
+        <w:sz w:val="20"/>
+      </w:rPr>
+    </w:lvl>
+    <w:lvl w:ilvl="8" w:tentative="1">
+      <w:start w:val="1"/>
+      <w:numFmt w:val="bullet"/>
+      <w:lvlText w:val=""/>
+      <w:lvlJc w:val="left"/>
+      <w:pPr>
+        <w:tabs>
+          <w:tab w:val="num" w:pos="6480"/>
+        </w:tabs>
+        <w:ind w:left="6480" w:hanging="360"/>
+      </w:pPr>
+      <w:rPr>
+        <w:rFonts w:ascii="Wingdings" w:hAnsi="Wingdings" w:hint="default"/>
+        <w:sz w:val="20"/>
+      </w:rPr>
+    </w:lvl>
+  </w:abstractNum>
+  <w:abstractNum w:abstractNumId="1" w15:restartNumberingAfterBreak="0">
+    <w:nsid w:val="17AA070F"/>
+    <w:multiLevelType w:val="multilevel"/>
+    <w:tmpl w:val="F828D0CC"/>
+    <w:lvl w:ilvl="0">
+      <w:start w:val="1"/>
+      <w:numFmt w:val="bullet"/>
+      <w:lvlText w:val=""/>
+      <w:lvlJc w:val="left"/>
+      <w:pPr>
+        <w:tabs>
+          <w:tab w:val="num" w:pos="720"/>
+        </w:tabs>
+        <w:ind w:left="720" w:hanging="360"/>
+      </w:pPr>
+      <w:rPr>
+        <w:rFonts w:ascii="Symbol" w:hAnsi="Symbol" w:hint="default"/>
+        <w:sz w:val="20"/>
+      </w:rPr>
+    </w:lvl>
+    <w:lvl w:ilvl="1" w:tentative="1">
+      <w:start w:val="1"/>
+      <w:numFmt w:val="bullet"/>
+      <w:lvlText w:val="o"/>
+      <w:lvlJc w:val="left"/>
+      <w:pPr>
+        <w:tabs>
+          <w:tab w:val="num" w:pos="1440"/>
+        </w:tabs>
+        <w:ind w:left="1440" w:hanging="360"/>
+      </w:pPr>
+      <w:rPr>
+        <w:rFonts w:ascii="Courier New" w:hAnsi="Courier New" w:hint="default"/>
+        <w:sz w:val="20"/>
+      </w:rPr>
+    </w:lvl>
+    <w:lvl w:ilvl="2" w:tentative="1">
+      <w:start w:val="1"/>
+      <w:numFmt w:val="bullet"/>
+      <w:lvlText w:val=""/>
+      <w:lvlJc w:val="left"/>
+      <w:pPr>
+        <w:tabs>
+          <w:tab w:val="num" w:pos="2160"/>
+        </w:tabs>
+        <w:ind w:left="2160" w:hanging="360"/>
+      </w:pPr>
+      <w:rPr>
+        <w:rFonts w:ascii="Wingdings" w:hAnsi="Wingdings" w:hint="default"/>
+        <w:sz w:val="20"/>
+      </w:rPr>
+    </w:lvl>
+    <w:lvl w:ilvl="3" w:tentative="1">
+      <w:start w:val="1"/>
+      <w:numFmt w:val="bullet"/>
+      <w:lvlText w:val=""/>
+      <w:lvlJc w:val="left"/>
+      <w:pPr>
+        <w:tabs>
+          <w:tab w:val="num" w:pos="2880"/>
+        </w:tabs>
+        <w:ind w:left="2880" w:hanging="360"/>
+      </w:pPr>
+      <w:rPr>
+        <w:rFonts w:ascii="Wingdings" w:hAnsi="Wingdings" w:hint="default"/>
+        <w:sz w:val="20"/>
+      </w:rPr>
+    </w:lvl>
+    <w:lvl w:ilvl="4" w:tentative="1">
+      <w:start w:val="1"/>
+      <w:numFmt w:val="bullet"/>
+      <w:lvlText w:val=""/>
+      <w:lvlJc w:val="left"/>
+      <w:pPr>
+        <w:tabs>
+          <w:tab w:val="num" w:pos="3600"/>
+        </w:tabs>
+        <w:ind w:left="3600" w:hanging="360"/>
+      </w:pPr>
+      <w:rPr>
+        <w:rFonts w:ascii="Wingdings" w:hAnsi="Wingdings" w:hint="default"/>
+        <w:sz w:val="20"/>
+      </w:rPr>
+    </w:lvl>
+    <w:lvl w:ilvl="5" w:tentative="1">
+      <w:start w:val="1"/>
+      <w:numFmt w:val="bullet"/>
+      <w:lvlText w:val=""/>
+      <w:lvlJc w:val="left"/>
+      <w:pPr>
+        <w:tabs>
+          <w:tab w:val="num" w:pos="4320"/>
+        </w:tabs>
+        <w:ind w:left="4320" w:hanging="360"/>
+      </w:pPr>
+      <w:rPr>
+        <w:rFonts w:ascii="Wingdings" w:hAnsi="Wingdings" w:hint="default"/>
+        <w:sz w:val="20"/>
+      </w:rPr>
+    </w:lvl>
+    <w:lvl w:ilvl="6" w:tentative="1">
+      <w:start w:val="1"/>
+      <w:numFmt w:val="bullet"/>
+      <w:lvlText w:val=""/>
+      <w:lvlJc w:val="left"/>
+      <w:pPr>
+        <w:tabs>
+          <w:tab w:val="num" w:pos="5040"/>
+        </w:tabs>
+        <w:ind w:left="5040" w:hanging="360"/>
+      </w:pPr>
+      <w:rPr>
+        <w:rFonts w:ascii="Wingdings" w:hAnsi="Wingdings" w:hint="default"/>
+        <w:sz w:val="20"/>
+      </w:rPr>
+    </w:lvl>
+    <w:lvl w:ilvl="7" w:tentative="1">
+      <w:start w:val="1"/>
+      <w:numFmt w:val="bullet"/>
+      <w:lvlText w:val=""/>
+      <w:lvlJc w:val="left"/>
+      <w:pPr>
+        <w:tabs>
+          <w:tab w:val="num" w:pos="5760"/>
+        </w:tabs>
+        <w:ind w:left="5760" w:hanging="360"/>
+      </w:pPr>
+      <w:rPr>
+        <w:rFonts w:ascii="Wingdings" w:hAnsi="Wingdings" w:hint="default"/>
+        <w:sz w:val="20"/>
+      </w:rPr>
+    </w:lvl>
+    <w:lvl w:ilvl="8" w:tentative="1">
+      <w:start w:val="1"/>
+      <w:numFmt w:val="bullet"/>
+      <w:lvlText w:val=""/>
+      <w:lvlJc w:val="left"/>
+      <w:pPr>
+        <w:tabs>
+          <w:tab w:val="num" w:pos="6480"/>
+        </w:tabs>
+        <w:ind w:left="6480" w:hanging="360"/>
+      </w:pPr>
+      <w:rPr>
+        <w:rFonts w:ascii="Wingdings" w:hAnsi="Wingdings" w:hint="default"/>
+        <w:sz w:val="20"/>
+      </w:rPr>
+    </w:lvl>
+  </w:abstractNum>
+  <w:abstractNum w:abstractNumId="2" w15:restartNumberingAfterBreak="0">
+    <w:nsid w:val="1AB94E94"/>
+    <w:multiLevelType w:val="multilevel"/>
+    <w:tmpl w:val="75C4617C"/>
+    <w:lvl w:ilvl="0">
+      <w:start w:val="1"/>
+      <w:numFmt w:val="bullet"/>
+      <w:lvlText w:val=""/>
+      <w:lvlJc w:val="left"/>
+      <w:pPr>
+        <w:tabs>
+          <w:tab w:val="num" w:pos="720"/>
+        </w:tabs>
+        <w:ind w:left="720" w:hanging="360"/>
+      </w:pPr>
+      <w:rPr>
+        <w:rFonts w:ascii="Symbol" w:hAnsi="Symbol" w:hint="default"/>
+        <w:sz w:val="20"/>
+      </w:rPr>
+    </w:lvl>
+    <w:lvl w:ilvl="1" w:tentative="1">
+      <w:start w:val="1"/>
+      <w:numFmt w:val="bullet"/>
+      <w:lvlText w:val="o"/>
+      <w:lvlJc w:val="left"/>
+      <w:pPr>
+        <w:tabs>
+          <w:tab w:val="num" w:pos="1440"/>
+        </w:tabs>
+        <w:ind w:left="1440" w:hanging="360"/>
+      </w:pPr>
+      <w:rPr>
+        <w:rFonts w:ascii="Courier New" w:hAnsi="Courier New" w:hint="default"/>
+        <w:sz w:val="20"/>
+      </w:rPr>
+    </w:lvl>
+    <w:lvl w:ilvl="2" w:tentative="1">
+      <w:start w:val="1"/>
+      <w:numFmt w:val="bullet"/>
+      <w:lvlText w:val=""/>
+      <w:lvlJc w:val="left"/>
+      <w:pPr>
+        <w:tabs>
+          <w:tab w:val="num" w:pos="2160"/>
+        </w:tabs>
+        <w:ind w:left="2160" w:hanging="360"/>
+      </w:pPr>
+      <w:rPr>
+        <w:rFonts w:ascii="Wingdings" w:hAnsi="Wingdings" w:hint="default"/>
+        <w:sz w:val="20"/>
+      </w:rPr>
+    </w:lvl>
+    <w:lvl w:ilvl="3" w:tentative="1">
+      <w:start w:val="1"/>
+      <w:numFmt w:val="bullet"/>
+      <w:lvlText w:val=""/>
+      <w:lvlJc w:val="left"/>
+      <w:pPr>
+        <w:tabs>
+          <w:tab w:val="num" w:pos="2880"/>
+        </w:tabs>
+        <w:ind w:left="2880" w:hanging="360"/>
+      </w:pPr>
+      <w:rPr>
+        <w:rFonts w:ascii="Wingdings" w:hAnsi="Wingdings" w:hint="default"/>
+        <w:sz w:val="20"/>
+      </w:rPr>
+    </w:lvl>
+    <w:lvl w:ilvl="4" w:tentative="1">
+      <w:start w:val="1"/>
+      <w:numFmt w:val="bullet"/>
+      <w:lvlText w:val=""/>
+      <w:lvlJc w:val="left"/>
+      <w:pPr>
+        <w:tabs>
+          <w:tab w:val="num" w:pos="3600"/>
+        </w:tabs>
+        <w:ind w:left="3600" w:hanging="360"/>
+      </w:pPr>
+      <w:rPr>
+        <w:rFonts w:ascii="Wingdings" w:hAnsi="Wingdings" w:hint="default"/>
+        <w:sz w:val="20"/>
+      </w:rPr>
+    </w:lvl>
+    <w:lvl w:ilvl="5" w:tentative="1">
+      <w:start w:val="1"/>
+      <w:numFmt w:val="bullet"/>
+      <w:lvlText w:val=""/>
+      <w:lvlJc w:val="left"/>
+      <w:pPr>
+        <w:tabs>
+          <w:tab w:val="num" w:pos="4320"/>
+        </w:tabs>
+        <w:ind w:left="4320" w:hanging="360"/>
+      </w:pPr>
+      <w:rPr>
+        <w:rFonts w:ascii="Wingdings" w:hAnsi="Wingdings" w:hint="default"/>
+        <w:sz w:val="20"/>
+      </w:rPr>
+    </w:lvl>
+    <w:lvl w:ilvl="6" w:tentative="1">
+      <w:start w:val="1"/>
+      <w:numFmt w:val="bullet"/>
+      <w:lvlText w:val=""/>
+      <w:lvlJc w:val="left"/>
+      <w:pPr>
+        <w:tabs>
+          <w:tab w:val="num" w:pos="5040"/>
+        </w:tabs>
+        <w:ind w:left="5040" w:hanging="360"/>
+      </w:pPr>
+      <w:rPr>
+        <w:rFonts w:ascii="Wingdings" w:hAnsi="Wingdings" w:hint="default"/>
+        <w:sz w:val="20"/>
+      </w:rPr>
+    </w:lvl>
+    <w:lvl w:ilvl="7" w:tentative="1">
+      <w:start w:val="1"/>
+      <w:numFmt w:val="bullet"/>
+      <w:lvlText w:val=""/>
+      <w:lvlJc w:val="left"/>
+      <w:pPr>
+        <w:tabs>
+          <w:tab w:val="num" w:pos="5760"/>
+        </w:tabs>
+        <w:ind w:left="5760" w:hanging="360"/>
+      </w:pPr>
+      <w:rPr>
+        <w:rFonts w:ascii="Wingdings" w:hAnsi="Wingdings" w:hint="default"/>
+        <w:sz w:val="20"/>
+      </w:rPr>
+    </w:lvl>
+    <w:lvl w:ilvl="8" w:tentative="1">
+      <w:start w:val="1"/>
+      <w:numFmt w:val="bullet"/>
+      <w:lvlText w:val=""/>
+      <w:lvlJc w:val="left"/>
+      <w:pPr>
+        <w:tabs>
+          <w:tab w:val="num" w:pos="6480"/>
+        </w:tabs>
+        <w:ind w:left="6480" w:hanging="360"/>
+      </w:pPr>
+      <w:rPr>
+        <w:rFonts w:ascii="Wingdings" w:hAnsi="Wingdings" w:hint="default"/>
+        <w:sz w:val="20"/>
+      </w:rPr>
+    </w:lvl>
+  </w:abstractNum>
+  <w:abstractNum w:abstractNumId="3" w15:restartNumberingAfterBreak="0">
+    <w:nsid w:val="1C9C430A"/>
+    <w:multiLevelType w:val="multilevel"/>
+    <w:tmpl w:val="1DB85E98"/>
+    <w:lvl w:ilvl="0">
+      <w:start w:val="1"/>
+      <w:numFmt w:val="bullet"/>
+      <w:lvlText w:val=""/>
+      <w:lvlJc w:val="left"/>
+      <w:pPr>
+        <w:tabs>
+          <w:tab w:val="num" w:pos="720"/>
+        </w:tabs>
+        <w:ind w:left="720" w:hanging="360"/>
+      </w:pPr>
+      <w:rPr>
+        <w:rFonts w:ascii="Symbol" w:hAnsi="Symbol" w:hint="default"/>
+        <w:sz w:val="20"/>
+      </w:rPr>
+    </w:lvl>
+    <w:lvl w:ilvl="1" w:tentative="1">
+      <w:start w:val="1"/>
+      <w:numFmt w:val="bullet"/>
+      <w:lvlText w:val="o"/>
+      <w:lvlJc w:val="left"/>
+      <w:pPr>
+        <w:tabs>
+          <w:tab w:val="num" w:pos="1440"/>
+        </w:tabs>
+        <w:ind w:left="1440" w:hanging="360"/>
+      </w:pPr>
+      <w:rPr>
+        <w:rFonts w:ascii="Courier New" w:hAnsi="Courier New" w:hint="default"/>
+        <w:sz w:val="20"/>
+      </w:rPr>
+    </w:lvl>
+    <w:lvl w:ilvl="2" w:tentative="1">
+      <w:start w:val="1"/>
+      <w:numFmt w:val="bullet"/>
+      <w:lvlText w:val=""/>
+      <w:lvlJc w:val="left"/>
+      <w:pPr>
+        <w:tabs>
+          <w:tab w:val="num" w:pos="2160"/>
+        </w:tabs>
+        <w:ind w:left="2160" w:hanging="360"/>
+      </w:pPr>
+      <w:rPr>
+        <w:rFonts w:ascii="Wingdings" w:hAnsi="Wingdings" w:hint="default"/>
+        <w:sz w:val="20"/>
+      </w:rPr>
+    </w:lvl>
+    <w:lvl w:ilvl="3" w:tentative="1">
+      <w:start w:val="1"/>
+      <w:numFmt w:val="bullet"/>
+      <w:lvlText w:val=""/>
+      <w:lvlJc w:val="left"/>
+      <w:pPr>
+        <w:tabs>
+          <w:tab w:val="num" w:pos="2880"/>
+        </w:tabs>
+        <w:ind w:left="2880" w:hanging="360"/>
+      </w:pPr>
+      <w:rPr>
+        <w:rFonts w:ascii="Wingdings" w:hAnsi="Wingdings" w:hint="default"/>
+        <w:sz w:val="20"/>
+      </w:rPr>
+    </w:lvl>
+    <w:lvl w:ilvl="4" w:tentative="1">
+      <w:start w:val="1"/>
+      <w:numFmt w:val="bullet"/>
+      <w:lvlText w:val=""/>
+      <w:lvlJc w:val="left"/>
+      <w:pPr>
+        <w:tabs>
+          <w:tab w:val="num" w:pos="3600"/>
+        </w:tabs>
+        <w:ind w:left="3600" w:hanging="360"/>
+      </w:pPr>
+      <w:rPr>
+        <w:rFonts w:ascii="Wingdings" w:hAnsi="Wingdings" w:hint="default"/>
+        <w:sz w:val="20"/>
+      </w:rPr>
+    </w:lvl>
+    <w:lvl w:ilvl="5" w:tentative="1">
+      <w:start w:val="1"/>
+      <w:numFmt w:val="bullet"/>
+      <w:lvlText w:val=""/>
+      <w:lvlJc w:val="left"/>
+      <w:pPr>
+        <w:tabs>
+          <w:tab w:val="num" w:pos="4320"/>
+        </w:tabs>
+        <w:ind w:left="4320" w:hanging="360"/>
+      </w:pPr>
+      <w:rPr>
+        <w:rFonts w:ascii="Wingdings" w:hAnsi="Wingdings" w:hint="default"/>
+        <w:sz w:val="20"/>
+      </w:rPr>
+    </w:lvl>
+    <w:lvl w:ilvl="6" w:tentative="1">
+      <w:start w:val="1"/>
+      <w:numFmt w:val="bullet"/>
+      <w:lvlText w:val=""/>
+      <w:lvlJc w:val="left"/>
+      <w:pPr>
+        <w:tabs>
+          <w:tab w:val="num" w:pos="5040"/>
+        </w:tabs>
+        <w:ind w:left="5040" w:hanging="360"/>
+      </w:pPr>
+      <w:rPr>
+        <w:rFonts w:ascii="Wingdings" w:hAnsi="Wingdings" w:hint="default"/>
+        <w:sz w:val="20"/>
+      </w:rPr>
+    </w:lvl>
+    <w:lvl w:ilvl="7" w:tentative="1">
+      <w:start w:val="1"/>
+      <w:numFmt w:val="bullet"/>
+      <w:lvlText w:val=""/>
+      <w:lvlJc w:val="left"/>
+      <w:pPr>
+        <w:tabs>
+          <w:tab w:val="num" w:pos="5760"/>
+        </w:tabs>
+        <w:ind w:left="5760" w:hanging="360"/>
+      </w:pPr>
+      <w:rPr>
+        <w:rFonts w:ascii="Wingdings" w:hAnsi="Wingdings" w:hint="default"/>
+        <w:sz w:val="20"/>
+      </w:rPr>
+    </w:lvl>
+    <w:lvl w:ilvl="8" w:tentative="1">
+      <w:start w:val="1"/>
+      <w:numFmt w:val="bullet"/>
+      <w:lvlText w:val=""/>
+      <w:lvlJc w:val="left"/>
+      <w:pPr>
+        <w:tabs>
+          <w:tab w:val="num" w:pos="6480"/>
+        </w:tabs>
+        <w:ind w:left="6480" w:hanging="360"/>
+      </w:pPr>
+      <w:rPr>
+        <w:rFonts w:ascii="Wingdings" w:hAnsi="Wingdings" w:hint="default"/>
+        <w:sz w:val="20"/>
+      </w:rPr>
+    </w:lvl>
+  </w:abstractNum>
+  <w:abstractNum w:abstractNumId="4" w15:restartNumberingAfterBreak="0">
+    <w:nsid w:val="621A4832"/>
+    <w:multiLevelType w:val="multilevel"/>
+    <w:tmpl w:val="E2B84E8A"/>
+    <w:lvl w:ilvl="0">
+      <w:start w:val="1"/>
+      <w:numFmt w:val="bullet"/>
+      <w:lvlText w:val=""/>
+      <w:lvlJc w:val="left"/>
+      <w:pPr>
+        <w:tabs>
+          <w:tab w:val="num" w:pos="720"/>
+        </w:tabs>
+        <w:ind w:left="720" w:hanging="360"/>
+      </w:pPr>
+      <w:rPr>
+        <w:rFonts w:ascii="Symbol" w:hAnsi="Symbol" w:hint="default"/>
+        <w:sz w:val="20"/>
+      </w:rPr>
+    </w:lvl>
+    <w:lvl w:ilvl="1" w:tentative="1">
+      <w:start w:val="1"/>
+      <w:numFmt w:val="bullet"/>
+      <w:lvlText w:val="o"/>
+      <w:lvlJc w:val="left"/>
+      <w:pPr>
+        <w:tabs>
+          <w:tab w:val="num" w:pos="1440"/>
+        </w:tabs>
+        <w:ind w:left="1440" w:hanging="360"/>
+      </w:pPr>
+      <w:rPr>
+        <w:rFonts w:ascii="Courier New" w:hAnsi="Courier New" w:hint="default"/>
+        <w:sz w:val="20"/>
+      </w:rPr>
+    </w:lvl>
+    <w:lvl w:ilvl="2" w:tentative="1">
+      <w:start w:val="1"/>
+      <w:numFmt w:val="bullet"/>
+      <w:lvlText w:val=""/>
+      <w:lvlJc w:val="left"/>
+      <w:pPr>
+        <w:tabs>
+          <w:tab w:val="num" w:pos="2160"/>
+        </w:tabs>
+        <w:ind w:left="2160" w:hanging="360"/>
+      </w:pPr>
+      <w:rPr>
+        <w:rFonts w:ascii="Wingdings" w:hAnsi="Wingdings" w:hint="default"/>
+        <w:sz w:val="20"/>
+      </w:rPr>
+    </w:lvl>
+    <w:lvl w:ilvl="3" w:tentative="1">
+      <w:start w:val="1"/>
+      <w:numFmt w:val="bullet"/>
+      <w:lvlText w:val=""/>
+      <w:lvlJc w:val="left"/>
+      <w:pPr>
+        <w:tabs>
+          <w:tab w:val="num" w:pos="2880"/>
+        </w:tabs>
+        <w:ind w:left="2880" w:hanging="360"/>
+      </w:pPr>
+      <w:rPr>
+        <w:rFonts w:ascii="Wingdings" w:hAnsi="Wingdings" w:hint="default"/>
+        <w:sz w:val="20"/>
+      </w:rPr>
+    </w:lvl>
+    <w:lvl w:ilvl="4" w:tentative="1">
+      <w:start w:val="1"/>
+      <w:numFmt w:val="bullet"/>
+      <w:lvlText w:val=""/>
+      <w:lvlJc w:val="left"/>
+      <w:pPr>
+        <w:tabs>
+          <w:tab w:val="num" w:pos="3600"/>
+        </w:tabs>
+        <w:ind w:left="3600" w:hanging="360"/>
+      </w:pPr>
+      <w:rPr>
+        <w:rFonts w:ascii="Wingdings" w:hAnsi="Wingdings" w:hint="default"/>
+        <w:sz w:val="20"/>
+      </w:rPr>
+    </w:lvl>
+    <w:lvl w:ilvl="5" w:tentative="1">
+      <w:start w:val="1"/>
+      <w:numFmt w:val="bullet"/>
+      <w:lvlText w:val=""/>
+      <w:lvlJc w:val="left"/>
+      <w:pPr>
+        <w:tabs>
+          <w:tab w:val="num" w:pos="4320"/>
+        </w:tabs>
+        <w:ind w:left="4320" w:hanging="360"/>
+      </w:pPr>
+      <w:rPr>
+        <w:rFonts w:ascii="Wingdings" w:hAnsi="Wingdings" w:hint="default"/>
+        <w:sz w:val="20"/>
+      </w:rPr>
+    </w:lvl>
+    <w:lvl w:ilvl="6" w:tentative="1">
+      <w:start w:val="1"/>
+      <w:numFmt w:val="bullet"/>
+      <w:lvlText w:val=""/>
+      <w:lvlJc w:val="left"/>
+      <w:pPr>
+        <w:tabs>
+          <w:tab w:val="num" w:pos="5040"/>
+        </w:tabs>
+        <w:ind w:left="5040" w:hanging="360"/>
+      </w:pPr>
+      <w:rPr>
+        <w:rFonts w:ascii="Wingdings" w:hAnsi="Wingdings" w:hint="default"/>
+        <w:sz w:val="20"/>
+      </w:rPr>
+    </w:lvl>
+    <w:lvl w:ilvl="7" w:tentative="1">
+      <w:start w:val="1"/>
+      <w:numFmt w:val="bullet"/>
+      <w:lvlText w:val=""/>
+      <w:lvlJc w:val="left"/>
+      <w:pPr>
+        <w:tabs>
+          <w:tab w:val="num" w:pos="5760"/>
+        </w:tabs>
+        <w:ind w:left="5760" w:hanging="360"/>
+      </w:pPr>
+      <w:rPr>
+        <w:rFonts w:ascii="Wingdings" w:hAnsi="Wingdings" w:hint="default"/>
+        <w:sz w:val="20"/>
+      </w:rPr>
+    </w:lvl>
+    <w:lvl w:ilvl="8" w:tentative="1">
+      <w:start w:val="1"/>
+      <w:numFmt w:val="bullet"/>
+      <w:lvlText w:val=""/>
+      <w:lvlJc w:val="left"/>
+      <w:pPr>
+        <w:tabs>
+          <w:tab w:val="num" w:pos="6480"/>
+        </w:tabs>
+        <w:ind w:left="6480" w:hanging="360"/>
+      </w:pPr>
+      <w:rPr>
+        <w:rFonts w:ascii="Wingdings" w:hAnsi="Wingdings" w:hint="default"/>
+        <w:sz w:val="20"/>
+      </w:rPr>
+    </w:lvl>
+  </w:abstractNum>
+  <w:num w:numId="1" w16cid:durableId="625549789">
+    <w:abstractNumId w:val="0"/>
+  </w:num>
+  <w:num w:numId="2" w16cid:durableId="1003434923">
+    <w:abstractNumId w:val="4"/>
+  </w:num>
+  <w:num w:numId="3" w16cid:durableId="1097016379">
+    <w:abstractNumId w:val="3"/>
+  </w:num>
+  <w:num w:numId="4" w16cid:durableId="885797981">
+    <w:abstractNumId w:val="2"/>
+  </w:num>
+  <w:num w:numId="5" w16cid:durableId="1551989134">
+    <w:abstractNumId w:val="1"/>
+  </w:num>
+</w:numbering>
 </file>
 
 <file path=word/styles.xml><?xml version="1.0" encoding="utf-8"?>
@@ -559,6 +2340,16 @@
   <w:style w:type="paragraph" w:default="1" w:styleId="Standard">
     <w:name w:val="Normal"/>
     <w:qFormat/>
+    <w:rsid w:val="00083703"/>
+    <w:pPr>
+      <w:spacing w:after="0" w:line="240" w:lineRule="auto"/>
+    </w:pPr>
+    <w:rPr>
+      <w:rFonts w:ascii="Times New Roman" w:eastAsia="Times New Roman" w:hAnsi="Times New Roman" w:cs="Times New Roman"/>
+      <w:kern w:val="0"/>
+      <w:lang w:eastAsia="de-DE"/>
+      <w14:ligatures w14:val="none"/>
+    </w:rPr>
   </w:style>
   <w:style w:type="paragraph" w:styleId="berschrift1">
     <w:name w:val="heading 1"/>
@@ -587,7 +2378,6 @@
     <w:next w:val="Standard"/>
     <w:link w:val="berschrift2Zchn"/>
     <w:uiPriority w:val="9"/>
-    <w:semiHidden/>
     <w:unhideWhenUsed/>
     <w:qFormat/>
     <w:rsid w:val="006F5D09"/>
@@ -683,7 +2473,7 @@
     <w:pPr>
       <w:keepNext/>
       <w:keepLines/>
-      <w:spacing w:before="40" w:after="0"/>
+      <w:spacing w:before="40"/>
       <w:outlineLvl w:val="5"/>
     </w:pPr>
     <w:rPr>
@@ -706,7 +2496,7 @@
     <w:pPr>
       <w:keepNext/>
       <w:keepLines/>
-      <w:spacing w:before="40" w:after="0"/>
+      <w:spacing w:before="40"/>
       <w:outlineLvl w:val="6"/>
     </w:pPr>
     <w:rPr>
@@ -727,7 +2517,6 @@
     <w:pPr>
       <w:keepNext/>
       <w:keepLines/>
-      <w:spacing w:after="0"/>
       <w:outlineLvl w:val="7"/>
     </w:pPr>
     <w:rPr>
@@ -750,7 +2539,6 @@
     <w:pPr>
       <w:keepNext/>
       <w:keepLines/>
-      <w:spacing w:after="0"/>
       <w:outlineLvl w:val="8"/>
     </w:pPr>
     <w:rPr>
@@ -803,7 +2591,6 @@
     <w:basedOn w:val="Absatz-Standardschriftart"/>
     <w:link w:val="berschrift2"/>
     <w:uiPriority w:val="9"/>
-    <w:semiHidden/>
     <w:rsid w:val="006F5D09"/>
     <w:rPr>
       <w:rFonts w:asciiTheme="majorHAnsi" w:eastAsiaTheme="majorEastAsia" w:hAnsiTheme="majorHAnsi" w:cstheme="majorBidi"/>
@@ -912,7 +2699,7 @@
     <w:qFormat/>
     <w:rsid w:val="006F5D09"/>
     <w:pPr>
-      <w:spacing w:after="80" w:line="240" w:lineRule="auto"/>
+      <w:spacing w:after="80"/>
       <w:contextualSpacing/>
     </w:pPr>
     <w:rPr>
@@ -1086,7 +2873,6 @@
         <w:tab w:val="center" w:pos="4536"/>
         <w:tab w:val="right" w:pos="9072"/>
       </w:tabs>
-      <w:spacing w:after="0" w:line="240" w:lineRule="auto"/>
     </w:pPr>
   </w:style>
   <w:style w:type="character" w:customStyle="1" w:styleId="KopfzeileZchn">
@@ -1108,7 +2894,6 @@
         <w:tab w:val="center" w:pos="4536"/>
         <w:tab w:val="right" w:pos="9072"/>
       </w:tabs>
-      <w:spacing w:after="0" w:line="240" w:lineRule="auto"/>
     </w:pPr>
   </w:style>
   <w:style w:type="character" w:customStyle="1" w:styleId="FuzeileZchn">
@@ -1117,6 +2902,40 @@
     <w:link w:val="Fuzeile"/>
     <w:uiPriority w:val="99"/>
     <w:rsid w:val="006F5D09"/>
+  </w:style>
+  <w:style w:type="paragraph" w:customStyle="1" w:styleId="s5">
+    <w:name w:val="s5"/>
+    <w:basedOn w:val="Standard"/>
+    <w:rsid w:val="00CD239E"/>
+    <w:pPr>
+      <w:spacing w:before="100" w:beforeAutospacing="1" w:after="100" w:afterAutospacing="1"/>
+    </w:pPr>
+  </w:style>
+  <w:style w:type="character" w:customStyle="1" w:styleId="s3">
+    <w:name w:val="s3"/>
+    <w:basedOn w:val="Absatz-Standardschriftart"/>
+    <w:rsid w:val="00CD239E"/>
+  </w:style>
+  <w:style w:type="character" w:customStyle="1" w:styleId="s4">
+    <w:name w:val="s4"/>
+    <w:basedOn w:val="Absatz-Standardschriftart"/>
+    <w:rsid w:val="00CD239E"/>
+  </w:style>
+  <w:style w:type="character" w:customStyle="1" w:styleId="apple-converted-space">
+    <w:name w:val="apple-converted-space"/>
+    <w:basedOn w:val="Absatz-Standardschriftart"/>
+    <w:rsid w:val="00CD239E"/>
+  </w:style>
+  <w:style w:type="paragraph" w:styleId="StandardWeb">
+    <w:name w:val="Normal (Web)"/>
+    <w:basedOn w:val="Standard"/>
+    <w:uiPriority w:val="99"/>
+    <w:semiHidden/>
+    <w:unhideWhenUsed/>
+    <w:rsid w:val="00083703"/>
+    <w:pPr>
+      <w:spacing w:before="100" w:beforeAutospacing="1" w:after="100" w:afterAutospacing="1"/>
+    </w:pPr>
   </w:style>
 </w:styles>
 </file>

</xml_diff>